<commit_message>
Update commercial proposal v2 per feedback: pilot, quote pool, Heytea stance
Co-authored-by: Romola1110 <Romola1110@users.noreply.github.com>
</commit_message>
<xml_diff>
--- a/商业策划案_心中念你_喜茶×给阿嬷的情书.docx
+++ b/商业策划案_心中念你_喜茶×给阿嬷的情书.docx
@@ -45,7 +45,7 @@
     </w:p>
     <w:p>
       <w:pPr>
-        <w:spacing w:after="120" w:before="0" w:line="360" w:lineRule="auto"/>
+        <w:spacing w:after="120" w:line="360" w:lineRule="auto"/>
         <w:jc w:val="center"/>
       </w:pPr>
       <w:r>
@@ -59,7 +59,7 @@
     </w:p>
     <w:p>
       <w:pPr>
-        <w:spacing w:after="120" w:before="0" w:line="360" w:lineRule="auto"/>
+        <w:spacing w:after="120" w:line="360" w:lineRule="auto"/>
         <w:jc w:val="center"/>
       </w:pPr>
       <w:r>
@@ -68,12 +68,12 @@
           <w:b w:val="0"/>
           <w:sz w:val="24"/>
         </w:rPr>
-        <w:t>副句轮换：念你安康。｜切要平安。｜纸短情长。</w:t>
+        <w:t>提案视角：面向喜茶联名决策与片方合作洽谈的商业策划方案（非媒体中介方案）</w:t>
       </w:r>
     </w:p>
     <w:p>
       <w:pPr>
-        <w:spacing w:after="120" w:before="0" w:line="360" w:lineRule="auto"/>
+        <w:spacing w:after="120" w:line="360" w:lineRule="auto"/>
         <w:jc w:val="center"/>
       </w:pPr>
       <w:r>
@@ -82,12 +82,12 @@
           <w:b w:val="0"/>
           <w:sz w:val="24"/>
         </w:rPr>
-        <w:t>提案用途：商业策划实习面试作业｜供导师审阅</w:t>
+        <w:t>用字说明：全文统一「阿嬷」，与电影片名一致。</w:t>
       </w:r>
     </w:p>
     <w:p>
       <w:pPr>
-        <w:spacing w:after="120" w:before="0" w:line="360" w:lineRule="auto"/>
+        <w:spacing w:after="120" w:line="360" w:lineRule="auto"/>
         <w:jc w:val="center"/>
       </w:pPr>
       <w:r>
@@ -96,7 +96,7 @@
           <w:b w:val="0"/>
           <w:sz w:val="24"/>
         </w:rPr>
-        <w:t>版本说明：文中涉及票房、联名案例等均标注公开来源；未核实处标「待确认」，不作杜撰。</w:t>
+        <w:t>第二版｜已按反馈修订立场、档期建议、金句池、试点范围</w:t>
       </w:r>
     </w:p>
     <w:p>
@@ -119,7 +119,7 @@
     </w:p>
     <w:p>
       <w:pPr>
-        <w:spacing w:after="120" w:before="0" w:line="360" w:lineRule="auto"/>
+        <w:spacing w:after="120" w:line="360" w:lineRule="auto"/>
         <w:ind w:firstLine="420"/>
       </w:pPr>
       <w:r>
@@ -136,62 +136,29 @@
           <w:b w:val="0"/>
           <w:sz w:val="24"/>
         </w:rPr>
-        <w:t>把电影里那句「心中念你，便不觉远」落成一杯茶、一张短笺、一次轻声惦记——不教人完成「表达任务」，只给年轻人一个停下来念你的理由。</w:t>
+        <w:t>把电影里「心中念你，便不觉远」落成一杯茶、一张短笺、一次轻声惦记——不教人完成表达任务，只给一个停下来念你的理由。</w:t>
       </w:r>
     </w:p>
     <w:p>
       <w:pPr>
-        <w:spacing w:before="200" w:after="160"/>
+        <w:spacing w:after="120" w:line="360" w:lineRule="auto"/>
+        <w:ind w:firstLine="420"/>
       </w:pPr>
       <w:r>
         <w:rPr>
-          <w:rFonts w:ascii="黑体" w:hAnsi="黑体" w:eastAsia="黑体"/>
+          <w:rFonts w:ascii="宋体" w:hAnsi="宋体" w:eastAsia="宋体"/>
           <w:b/>
-          <w:sz w:val="28"/>
+          <w:sz w:val="24"/>
         </w:rPr>
-        <w:t>核心判断</w:t>
+        <w:t>提案立场：</w:t>
       </w:r>
-    </w:p>
-    <w:p>
-      <w:pPr>
-        <w:pStyle w:val="ListBullet"/>
-        <w:spacing w:line="360" w:lineRule="auto"/>
-      </w:pPr>
       <w:r>
         <w:rPr>
           <w:rFonts w:ascii="宋体" w:hAnsi="宋体" w:eastAsia="宋体"/>
           <w:b w:val="0"/>
           <w:sz w:val="24"/>
         </w:rPr>
-        <w:t>电影《给阿嬷的情书》以侨批为线索，讲的是山海之间的守望、代写代寄的情义，以及「报平安」式的日常牵挂——不是口号式告白。</w:t>
-      </w:r>
-    </w:p>
-    <w:p>
-      <w:pPr>
-        <w:pStyle w:val="ListBullet"/>
-        <w:spacing w:line="360" w:lineRule="auto"/>
-      </w:pPr>
-      <w:r>
-        <w:rPr>
-          <w:rFonts w:ascii="宋体" w:hAnsi="宋体" w:eastAsia="宋体"/>
-          <w:b w:val="0"/>
-          <w:sz w:val="24"/>
-        </w:rPr>
-        <w:t>公开报道显示：阿嬷手作、一杯潮茶等已与电影做过轻量联名并出圈；喜茶尚未与该片官联，但2025年联名已走向「少而精、偏治愈」。</w:t>
-      </w:r>
-    </w:p>
-    <w:p>
-      <w:pPr>
-        <w:pStyle w:val="ListBullet"/>
-        <w:spacing w:line="360" w:lineRule="auto"/>
-      </w:pPr>
-      <w:r>
-        <w:rPr>
-          <w:rFonts w:ascii="宋体" w:hAnsi="宋体" w:eastAsia="宋体"/>
-          <w:b w:val="0"/>
-          <w:sz w:val="24"/>
-        </w:rPr>
-        <w:t>本案不做复杂口味发明，而做：成熟茶底上的情绪命名 + 家书触点 + 观影票根接力 + 轻门店装置。</w:t>
+        <w:t>以喜茶为联名执行主体、电影《给阿嬷的情书》为IP授权与情感内容方，撰写可洽谈、可落地的联名企划。不涉及第三方媒体中介角色。</w:t>
       </w:r>
     </w:p>
     <w:p>
@@ -280,7 +247,7 @@
                 <w:b w:val="0"/>
                 <w:sz w:val="21"/>
               </w:rPr>
-              <w:t>主推款「念你」：焙香红茶牛乳系；备选轻乳茶一款。供应链尽量复用喜茶现有茶底/奶基底。</w:t>
+              <w:t>主推「念你」（焙香红茶牛乳系）；备选轻乳一款。复用喜茶成熟茶底/小料。</w:t>
             </w:r>
           </w:p>
         </w:tc>
@@ -314,7 +281,7 @@
                 <w:b w:val="0"/>
                 <w:sz w:val="21"/>
               </w:rPr>
-              <w:t>信封感杯套、随机短句杯身/杯套内侧、小票一句、重点门店「念你信箱」。</w:t>
+              <w:t>杯套短句轮换（金句池）、小票、重点店「念你信箱」；可写给阿嬷或心里惦记的人。</w:t>
             </w:r>
           </w:p>
         </w:tc>
@@ -348,68 +315,13 @@
                 <w:b w:val="0"/>
                 <w:sz w:val="21"/>
               </w:rPr>
-              <w:t>凭电影票根购联名款赠家书卡/贴纸；1–2城轻快闪「收批处」；UGC#心中念你。</w:t>
+              <w:t>先试点：华南+1个媒体城市；凭票根购联名款赠家书卡；1城轻快闪「收批处」（可选）。</w:t>
             </w:r>
           </w:p>
         </w:tc>
       </w:tr>
     </w:tbl>
     <w:p/>
-    <w:p>
-      <w:pPr>
-        <w:spacing w:before="200" w:after="160"/>
-      </w:pPr>
-      <w:r>
-        <w:rPr>
-          <w:rFonts w:ascii="黑体" w:hAnsi="黑体" w:eastAsia="黑体"/>
-          <w:b/>
-          <w:sz w:val="28"/>
-        </w:rPr>
-        <w:t>建议成功指标（区间待双方校准，不写死虚假数字）</w:t>
-      </w:r>
-    </w:p>
-    <w:p>
-      <w:pPr>
-        <w:pStyle w:val="ListBullet"/>
-        <w:spacing w:line="360" w:lineRule="auto"/>
-      </w:pPr>
-      <w:r>
-        <w:rPr>
-          <w:rFonts w:ascii="宋体" w:hAnsi="宋体" w:eastAsia="宋体"/>
-          <w:b w:val="0"/>
-          <w:sz w:val="24"/>
-        </w:rPr>
-        <w:t>销售：联名期联名套餐在重点城市门店的杯量与套餐售罄节奏（对照Chiikawa/星星人级周边热度，作内部对标，不作对外承诺）。</w:t>
-      </w:r>
-    </w:p>
-    <w:p>
-      <w:pPr>
-        <w:pStyle w:val="ListBullet"/>
-        <w:spacing w:line="360" w:lineRule="auto"/>
-      </w:pPr>
-      <w:r>
-        <w:rPr>
-          <w:rFonts w:ascii="宋体" w:hAnsi="宋体" w:eastAsia="宋体"/>
-          <w:b w:val="0"/>
-          <w:sz w:val="24"/>
-        </w:rPr>
-        <w:t>传播：话题阅读量、UGC投稿量、票根核销率、联名相关笔记/视频条数。</w:t>
-      </w:r>
-    </w:p>
-    <w:p>
-      <w:pPr>
-        <w:pStyle w:val="ListBullet"/>
-        <w:spacing w:line="360" w:lineRule="auto"/>
-      </w:pPr>
-      <w:r>
-        <w:rPr>
-          <w:rFonts w:ascii="宋体" w:hAnsi="宋体" w:eastAsia="宋体"/>
-          <w:b w:val="0"/>
-          <w:sz w:val="24"/>
-        </w:rPr>
-        <w:t>品牌：联名前后「温暖/思念/家」相关声量占比变化（可用社媒监测工具复盘）。</w:t>
-      </w:r>
-    </w:p>
     <w:p>
       <w:pPr>
         <w:spacing w:before="280" w:after="160"/>
@@ -433,118 +345,12 @@
           <w:b/>
           <w:sz w:val="28"/>
         </w:rPr>
-        <w:t>1.1 电影侧：一部被侨批托住的黑马</w:t>
+        <w:t>1.1 电影：侨批托住的黑马</w:t>
       </w:r>
     </w:p>
     <w:p>
       <w:pPr>
-        <w:spacing w:after="120" w:before="0" w:line="360" w:lineRule="auto"/>
-        <w:ind w:firstLine="420"/>
-      </w:pPr>
-      <w:r>
-        <w:rPr>
-          <w:rFonts w:ascii="宋体" w:hAnsi="宋体" w:eastAsia="宋体"/>
-          <w:b/>
-          <w:sz w:val="24"/>
-        </w:rPr>
-        <w:t>《给阿嬷的情书》</w:t>
-      </w:r>
-      <w:r>
-        <w:rPr>
-          <w:rFonts w:ascii="宋体" w:hAnsi="宋体" w:eastAsia="宋体"/>
-          <w:b w:val="0"/>
-          <w:sz w:val="24"/>
-        </w:rPr>
-        <w:t>由蓝鸿春执导，2026年4月30日中国大陆上映，片长约118分钟，主要使用潮汕话等对白。影片讲述潮汕阿嬷叶淑柔半生守候，孙子远赴泰国寻亲，却揭开真相：多年来以阿公名义写信寄款的，是素未谋面的女子谢南枝——她在阿公离世后，以代写代寄撑起两头的家。</w:t>
-      </w:r>
-    </w:p>
-    <w:p>
-      <w:pPr>
-        <w:spacing w:after="120" w:before="0" w:line="360" w:lineRule="auto"/>
-        <w:ind w:firstLine="420"/>
-      </w:pPr>
-      <w:r>
-        <w:rPr>
-          <w:rFonts w:ascii="宋体" w:hAnsi="宋体" w:eastAsia="宋体"/>
-          <w:b/>
-          <w:sz w:val="24"/>
-        </w:rPr>
-        <w:t>公开可核实信息（摘录）：</w:t>
-      </w:r>
-      <w:r>
-        <w:rPr>
-          <w:rFonts w:ascii="宋体" w:hAnsi="宋体" w:eastAsia="宋体"/>
-          <w:b w:val="0"/>
-          <w:sz w:val="24"/>
-        </w:rPr>
-        <w:t>制作成本公开报道约为</w:t>
-      </w:r>
-      <w:r>
-        <w:rPr>
-          <w:rFonts w:ascii="宋体" w:hAnsi="宋体" w:eastAsia="宋体"/>
-          <w:b/>
-          <w:sz w:val="24"/>
-        </w:rPr>
-        <w:t>1400万人民币</w:t>
-      </w:r>
-      <w:r>
-        <w:rPr>
-          <w:rFonts w:ascii="宋体" w:hAnsi="宋体" w:eastAsia="宋体"/>
-          <w:b w:val="0"/>
-          <w:sz w:val="24"/>
-        </w:rPr>
-        <w:t>量级；上映后口碑强劲，豆瓣评分长期维持在</w:t>
-      </w:r>
-      <w:r>
-        <w:rPr>
-          <w:rFonts w:ascii="宋体" w:hAnsi="宋体" w:eastAsia="宋体"/>
-          <w:b/>
-          <w:sz w:val="24"/>
-        </w:rPr>
-        <w:t>9.0以上</w:t>
-      </w:r>
-      <w:r>
-        <w:rPr>
-          <w:rFonts w:ascii="宋体" w:hAnsi="宋体" w:eastAsia="宋体"/>
-          <w:b w:val="0"/>
-          <w:sz w:val="24"/>
-        </w:rPr>
-        <w:t>（开分约9.0，后有报道升至约9.1–9.2）；票房持续攀升，</w:t>
-      </w:r>
-      <w:r>
-        <w:rPr>
-          <w:rFonts w:ascii="宋体" w:hAnsi="宋体" w:eastAsia="宋体"/>
-          <w:b/>
-          <w:sz w:val="24"/>
-        </w:rPr>
-        <w:t>2026年6月27日猫眼专业版口径下，上映59天总票房破19亿元</w:t>
-      </w:r>
-      <w:r>
-        <w:rPr>
-          <w:rFonts w:ascii="宋体" w:hAnsi="宋体" w:eastAsia="宋体"/>
-          <w:b w:val="0"/>
-          <w:sz w:val="24"/>
-        </w:rPr>
-        <w:t>（36氪快讯）。维基百科词条亦收录总票房约18.52亿元等汇总口径——具体以猫眼/灯塔实时数据为准。</w:t>
-      </w:r>
-    </w:p>
-    <w:p>
-      <w:pPr>
-        <w:spacing w:after="120"/>
-      </w:pPr>
-      <w:r>
-        <w:rPr>
-          <w:rFonts w:ascii="楷体" w:hAnsi="楷体" w:eastAsia="楷体"/>
-          <w:b w:val="0"/>
-          <w:color w:val="666666"/>
-          <w:sz w:val="20"/>
-        </w:rPr>
-        <w:t>【数据说明】票房数字随时间变化。引用时请以提案当日猫眼/灯塔截图更新；本稿写明来源与时间节点，避免写成永恒定值。</w:t>
-      </w:r>
-    </w:p>
-    <w:p>
-      <w:pPr>
-        <w:spacing w:after="120" w:before="0" w:line="360" w:lineRule="auto"/>
+        <w:spacing w:after="120" w:line="360" w:lineRule="auto"/>
         <w:ind w:firstLine="420"/>
       </w:pPr>
       <w:r>
@@ -553,7 +359,18 @@
           <w:b w:val="0"/>
           <w:sz w:val="24"/>
         </w:rPr>
-        <w:t>对本案真正重要的，不是「又一部爆款」，而是它提供的可转化情感结构：</w:t>
+        <w:t>《给阿嬷的情书》（蓝鸿春，2026年4月30日上映）以潮汕侨批为线索：阿嬷叶淑柔半生守候，孙子赴泰寻亲，揭开谢南枝代写代寄十八年的情义。公开报道制作成本约1400万人民币量级；豆瓣评分长期9.0以上；2026年6月27日猫眼专业版口径上映59天票房破19亿元（36氪快讯）。具体以提案日实时票房为准。</w:t>
+      </w:r>
+    </w:p>
+    <w:p>
+      <w:r>
+        <w:rPr>
+          <w:rFonts w:ascii="楷体" w:hAnsi="楷体" w:eastAsia="楷体"/>
+          <w:b w:val="0"/>
+          <w:color w:val="666666"/>
+          <w:sz w:val="20"/>
+        </w:rPr>
+        <w:t>【数据说明】票房随时间变化，引用时请更新截图。</w:t>
       </w:r>
     </w:p>
     <w:p>
@@ -567,49 +384,7 @@
           <w:b w:val="0"/>
           <w:sz w:val="24"/>
         </w:rPr>
-        <w:t>载体：侨批——信与钱合一，「见字如面」。</w:t>
-      </w:r>
-    </w:p>
-    <w:p>
-      <w:pPr>
-        <w:pStyle w:val="ListBullet"/>
-        <w:spacing w:line="360" w:lineRule="auto"/>
-      </w:pPr>
-      <w:r>
-        <w:rPr>
-          <w:rFonts w:ascii="宋体" w:hAnsi="宋体" w:eastAsia="宋体"/>
-          <w:b w:val="0"/>
-          <w:sz w:val="24"/>
-        </w:rPr>
-        <w:t>动作：寄出、等待、代寄——情义可以替人完成。</w:t>
-      </w:r>
-    </w:p>
-    <w:p>
-      <w:pPr>
-        <w:pStyle w:val="ListBullet"/>
-        <w:spacing w:line="360" w:lineRule="auto"/>
-      </w:pPr>
-      <w:r>
-        <w:rPr>
-          <w:rFonts w:ascii="宋体" w:hAnsi="宋体" w:eastAsia="宋体"/>
-          <w:b w:val="0"/>
-          <w:sz w:val="24"/>
-        </w:rPr>
-        <w:t>语气：不吼爱，报平安——「念你安康」「切要平安」「纸短情长」。</w:t>
-      </w:r>
-    </w:p>
-    <w:p>
-      <w:pPr>
-        <w:pStyle w:val="ListBullet"/>
-        <w:spacing w:line="360" w:lineRule="auto"/>
-      </w:pPr>
-      <w:r>
-        <w:rPr>
-          <w:rFonts w:ascii="宋体" w:hAnsi="宋体" w:eastAsia="宋体"/>
-          <w:b w:val="0"/>
-          <w:sz w:val="24"/>
-        </w:rPr>
-        <w:t>余味：走出影院后，情绪还需要一个轻出口。阿嬷手作「票根→一杯茶→侨批卡」已验证这条路径。</w:t>
+        <w:t>可转化结构：侨批（见字如面）→ 寄出/代寄 → 报平安语气（念你安康、切要平安）→ 观影后需要轻出口。</w:t>
       </w:r>
     </w:p>
     <w:p>
@@ -622,21 +397,7 @@
           <w:b/>
           <w:sz w:val="28"/>
         </w:rPr>
-        <w:t>1.2 电影已有联名先例（必须写进案，证明非空想）</w:t>
-      </w:r>
-    </w:p>
-    <w:p>
-      <w:pPr>
-        <w:spacing w:after="120" w:before="0" w:line="360" w:lineRule="auto"/>
-        <w:ind w:firstLine="420"/>
-      </w:pPr>
-      <w:r>
-        <w:rPr>
-          <w:rFonts w:ascii="宋体" w:hAnsi="宋体" w:eastAsia="宋体"/>
-          <w:b w:val="0"/>
-          <w:sz w:val="24"/>
-        </w:rPr>
-        <w:t>据界面新闻、36氪、SocialBeta等公开报道，电影宣发期出现过一批偏「情义互助」的合作，而非传统高额冠名：</w:t>
+        <w:t>1.2 已有联名先例（非空想）</w:t>
       </w:r>
     </w:p>
     <w:tbl>
@@ -679,7 +440,7 @@
                 <w:b/>
                 <w:sz w:val="22"/>
               </w:rPr>
-              <w:t>公开可见的合作形态</w:t>
+              <w:t>公开合作形态</w:t>
             </w:r>
           </w:p>
         </w:tc>
@@ -695,7 +456,7 @@
                 <w:b/>
                 <w:sz w:val="22"/>
               </w:rPr>
-              <w:t>可借鉴点</w:t>
+              <w:t>借鉴</w:t>
             </w:r>
           </w:p>
         </w:tc>
@@ -713,7 +474,7 @@
                 <w:b w:val="0"/>
                 <w:sz w:val="21"/>
               </w:rPr>
-              <w:t>一杯潮茶（汕头本土茶饮）</w:t>
+              <w:t>一杯潮茶</w:t>
             </w:r>
           </w:p>
         </w:tc>
@@ -729,7 +490,7 @@
                 <w:b w:val="0"/>
                 <w:sz w:val="21"/>
               </w:rPr>
-              <w:t>发行相关邀约；资源互换（片尾露出↔门店宣传）；联名杯套、冰箱贴；路演送饮；观影相关套餐</w:t>
+              <w:t>资源互换、杯套/冰箱贴、路演送饮、观影套餐</w:t>
             </w:r>
           </w:p>
         </w:tc>
@@ -745,7 +506,7 @@
                 <w:b w:val="0"/>
                 <w:sz w:val="21"/>
               </w:rPr>
-              <w:t>轻包材、互宣、观影场景衔接</w:t>
+              <w:t>轻包材、互宣、观影衔接</w:t>
             </w:r>
           </w:p>
         </w:tc>
@@ -779,7 +540,7 @@
                 <w:b w:val="0"/>
                 <w:sz w:val="21"/>
               </w:rPr>
-              <w:t>联名饮品「柑榄与单丛」（橄榄、油柑、单丛等）；侨批/家书信卡周边；凭票根优惠（报道称19.9元档）；母亲节等节点联动</w:t>
+              <w:t>「柑榄与单丛」、侨批信卡、凭票根优惠（报道19.9元档）</w:t>
             </w:r>
           </w:p>
         </w:tc>
@@ -795,7 +556,7 @@
                 <w:b w:val="0"/>
                 <w:sz w:val="21"/>
               </w:rPr>
-              <w:t>风物入味+侨批周边+票根机制</w:t>
+              <w:t>风物+侨批卡+票根机制</w:t>
             </w:r>
           </w:p>
         </w:tc>
@@ -813,7 +574,7 @@
                 <w:b w:val="0"/>
                 <w:sz w:val="21"/>
               </w:rPr>
-              <w:t>陈记顺和等本地餐饮</w:t>
+              <w:t>本地餐饮等</w:t>
             </w:r>
           </w:p>
         </w:tc>
@@ -829,7 +590,7 @@
                 <w:b w:val="0"/>
                 <w:sz w:val="21"/>
               </w:rPr>
-              <w:t>海报露出、票根福利、路演供餐</w:t>
+              <w:t>海报、票根福利、路演供餐</w:t>
             </w:r>
           </w:p>
         </w:tc>
@@ -845,57 +606,7 @@
                 <w:b w:val="0"/>
                 <w:sz w:val="21"/>
               </w:rPr>
-              <w:t>低成本本地情义赞助</w:t>
-            </w:r>
-          </w:p>
-        </w:tc>
-      </w:tr>
-      <w:tr>
-        <w:tc>
-          <w:tcPr>
-            <w:tcW w:type="dxa" w:w="3022"/>
-          </w:tcPr>
-          <w:p>
-            <w:r/>
-            <w:r>
-              <w:rPr>
-                <w:rFonts w:ascii="宋体" w:hAnsi="宋体" w:eastAsia="宋体"/>
-                <w:b w:val="0"/>
-                <w:sz w:val="21"/>
-              </w:rPr>
-              <w:t>潮汕文旅</w:t>
-            </w:r>
-          </w:p>
-        </w:tc>
-        <w:tc>
-          <w:tcPr>
-            <w:tcW w:type="dxa" w:w="3022"/>
-          </w:tcPr>
-          <w:p>
-            <w:r/>
-            <w:r>
-              <w:rPr>
-                <w:rFonts w:ascii="宋体" w:hAnsi="宋体" w:eastAsia="宋体"/>
-                <w:b w:val="0"/>
-                <w:sz w:val="21"/>
-              </w:rPr>
-              <w:t>取景地打卡、「跟着阿嬷游」类线路、侨批馆等参观升温（地方媒体/税务相关报道有提及）</w:t>
-            </w:r>
-          </w:p>
-        </w:tc>
-        <w:tc>
-          <w:tcPr>
-            <w:tcW w:type="dxa" w:w="3022"/>
-          </w:tcPr>
-          <w:p>
-            <w:r/>
-            <w:r>
-              <w:rPr>
-                <w:rFonts w:ascii="宋体" w:hAnsi="宋体" w:eastAsia="宋体"/>
-                <w:b w:val="0"/>
-                <w:sz w:val="21"/>
-              </w:rPr>
-              <w:t>电影→日常场景转化</w:t>
+              <w:t>低成本情义合作</w:t>
             </w:r>
           </w:p>
         </w:tc>
@@ -904,7 +615,7 @@
     <w:p/>
     <w:p>
       <w:pPr>
-        <w:spacing w:after="120" w:before="0" w:line="360" w:lineRule="auto"/>
+        <w:spacing w:after="120" w:line="360" w:lineRule="auto"/>
         <w:ind w:firstLine="420"/>
       </w:pPr>
       <w:r>
@@ -913,7 +624,7 @@
           <w:b/>
           <w:sz w:val="24"/>
         </w:rPr>
-        <w:t>结论：</w:t>
+        <w:t>喜茶与电影：</w:t>
       </w:r>
       <w:r>
         <w:rPr>
@@ -921,182 +632,7 @@
           <w:b w:val="0"/>
           <w:sz w:val="24"/>
         </w:rPr>
-        <w:t>「杯套、家书卡、票根福利」已被市场验证。本案不是发明机制，而是把已验证机制放到喜茶的全国门店网络上放大。</w:t>
-      </w:r>
-    </w:p>
-    <w:p>
-      <w:pPr>
-        <w:spacing w:before="200" w:after="160"/>
-      </w:pPr>
-      <w:r>
-        <w:rPr>
-          <w:rFonts w:ascii="黑体" w:hAnsi="黑体" w:eastAsia="黑体"/>
-          <w:b/>
-          <w:sz w:val="28"/>
-        </w:rPr>
-        <w:t>1.3 喜茶侧：联名策略与空白点</w:t>
-      </w:r>
-    </w:p>
-    <w:p>
-      <w:pPr>
-        <w:spacing w:after="120" w:before="0" w:line="360" w:lineRule="auto"/>
-        <w:ind w:firstLine="420"/>
-      </w:pPr>
-      <w:r>
-        <w:rPr>
-          <w:rFonts w:ascii="宋体" w:hAnsi="宋体" w:eastAsia="宋体"/>
-          <w:b w:val="0"/>
-          <w:sz w:val="24"/>
-        </w:rPr>
-        <w:t>据深圳新闻网、广告门等2025年末消费观察：喜茶联名从高频转向</w:t>
-      </w:r>
-      <w:r>
-        <w:rPr>
-          <w:rFonts w:ascii="宋体" w:hAnsi="宋体" w:eastAsia="宋体"/>
-          <w:b/>
-          <w:sz w:val="24"/>
-        </w:rPr>
-        <w:t>「降频提质」</w:t>
-      </w:r>
-      <w:r>
-        <w:rPr>
-          <w:rFonts w:ascii="宋体" w:hAnsi="宋体" w:eastAsia="宋体"/>
-          <w:b w:val="0"/>
-          <w:sz w:val="24"/>
-        </w:rPr>
-        <w:t>；有报道称2025年联名频率从早年高峰期的较高频次，收敛到全年约</w:t>
-      </w:r>
-      <w:r>
-        <w:rPr>
-          <w:rFonts w:ascii="宋体" w:hAnsi="宋体" w:eastAsia="宋体"/>
-          <w:b/>
-          <w:sz w:val="24"/>
-        </w:rPr>
-        <w:t>两次IP联名</w:t>
-      </w:r>
-      <w:r>
-        <w:rPr>
-          <w:rFonts w:ascii="宋体" w:hAnsi="宋体" w:eastAsia="宋体"/>
-          <w:b w:val="0"/>
-          <w:sz w:val="24"/>
-        </w:rPr>
-        <w:t>——公开点名的是</w:t>
-      </w:r>
-      <w:r>
-        <w:rPr>
-          <w:rFonts w:ascii="宋体" w:hAnsi="宋体" w:eastAsia="宋体"/>
-          <w:b/>
-          <w:sz w:val="24"/>
-        </w:rPr>
-        <w:t>CHIIKAWA（吉伊卡哇）</w:t>
-      </w:r>
-      <w:r>
-        <w:rPr>
-          <w:rFonts w:ascii="宋体" w:hAnsi="宋体" w:eastAsia="宋体"/>
-          <w:b w:val="0"/>
-          <w:sz w:val="24"/>
-        </w:rPr>
-        <w:t>与</w:t>
-      </w:r>
-      <w:r>
-        <w:rPr>
-          <w:rFonts w:ascii="宋体" w:hAnsi="宋体" w:eastAsia="宋体"/>
-          <w:b/>
-          <w:sz w:val="24"/>
-        </w:rPr>
-        <w:t>泡泡玛特星星人</w:t>
-      </w:r>
-      <w:r>
-        <w:rPr>
-          <w:rFonts w:ascii="宋体" w:hAnsi="宋体" w:eastAsia="宋体"/>
-          <w:b w:val="0"/>
-          <w:sz w:val="24"/>
-        </w:rPr>
-        <w:t>，强调治愈、情感与品牌契合，并出现主题店、包材周边、快闪等组合拳；星星人联名还被表述为喜茶</w:t>
-      </w:r>
-      <w:r>
-        <w:rPr>
-          <w:rFonts w:ascii="宋体" w:hAnsi="宋体" w:eastAsia="宋体"/>
-          <w:b/>
-          <w:sz w:val="24"/>
-        </w:rPr>
-        <w:t>首个全球同步上线</w:t>
-      </w:r>
-      <w:r>
-        <w:rPr>
-          <w:rFonts w:ascii="宋体" w:hAnsi="宋体" w:eastAsia="宋体"/>
-          <w:b w:val="0"/>
-          <w:sz w:val="24"/>
-        </w:rPr>
-        <w:t>的联名之一。</w:t>
-      </w:r>
-    </w:p>
-    <w:p>
-      <w:pPr>
-        <w:spacing w:after="120" w:before="0" w:line="360" w:lineRule="auto"/>
-        <w:ind w:firstLine="420"/>
-      </w:pPr>
-      <w:r>
-        <w:rPr>
-          <w:rFonts w:ascii="宋体" w:hAnsi="宋体" w:eastAsia="宋体"/>
-          <w:b/>
-          <w:sz w:val="24"/>
-        </w:rPr>
-        <w:t>与电影关系：</w:t>
-      </w:r>
-      <w:r>
-        <w:rPr>
-          <w:rFonts w:ascii="宋体" w:hAnsi="宋体" w:eastAsia="宋体"/>
-          <w:b w:val="0"/>
-          <w:sz w:val="24"/>
-        </w:rPr>
-        <w:t>检索公开报道，</w:t>
-      </w:r>
-      <w:r>
-        <w:rPr>
-          <w:rFonts w:ascii="宋体" w:hAnsi="宋体" w:eastAsia="宋体"/>
-          <w:b/>
-          <w:sz w:val="24"/>
-        </w:rPr>
-        <w:t>未见喜茶与《给阿嬷的情书》的官方联名</w:t>
-      </w:r>
-      <w:r>
-        <w:rPr>
-          <w:rFonts w:ascii="宋体" w:hAnsi="宋体" w:eastAsia="宋体"/>
-          <w:b w:val="0"/>
-          <w:sz w:val="24"/>
-        </w:rPr>
-        <w:t>；存在因潮汕原料/命名等引发的网友联想与催联名讨论。本案定位为：</w:t>
-      </w:r>
-      <w:r>
-        <w:rPr>
-          <w:rFonts w:ascii="宋体" w:hAnsi="宋体" w:eastAsia="宋体"/>
-          <w:b/>
-          <w:sz w:val="24"/>
-        </w:rPr>
-        <w:t>填补「全国级茶饮 × 爆款侨批电影」的官方空白</w:t>
-      </w:r>
-      <w:r>
-        <w:rPr>
-          <w:rFonts w:ascii="宋体" w:hAnsi="宋体" w:eastAsia="宋体"/>
-          <w:b w:val="0"/>
-          <w:sz w:val="24"/>
-        </w:rPr>
-        <w:t>，同时对齐喜茶「少而精、偏温暖」的既有选择逻辑。</w:t>
-      </w:r>
-    </w:p>
-    <w:p>
-      <w:pPr>
-        <w:spacing w:after="120"/>
-      </w:pPr>
-      <w:r>
-        <w:rPr>
-          <w:rFonts w:ascii="楷体" w:hAnsi="楷体" w:eastAsia="楷体"/>
-          <w:b w:val="0"/>
-          <w:color w:val="666666"/>
-          <w:sz w:val="20"/>
-        </w:rPr>
-        <w:t>【数据说明】「催联名」属舆论现象，不作「已有合作」表述。提案中禁止写「喜茶已官宣合作」。</w:t>
+        <w:t>公开报道未见官方联名；存在网友催联名讨论。本案填补全国级茶饮×该片官联空白，并对齐喜茶2025年「降频提质」、Chiikawa/星星人式情感联名逻辑。</w:t>
       </w:r>
     </w:p>
     <w:p>
@@ -1110,19 +646,6 @@
           <w:sz w:val="32"/>
         </w:rPr>
         <w:t>二、合作目标与KPI框架</w:t>
-      </w:r>
-    </w:p>
-    <w:p>
-      <w:pPr>
-        <w:spacing w:before="200" w:after="160"/>
-      </w:pPr>
-      <w:r>
-        <w:rPr>
-          <w:rFonts w:ascii="黑体" w:hAnsi="黑体" w:eastAsia="黑体"/>
-          <w:b/>
-          <w:sz w:val="28"/>
-        </w:rPr>
-        <w:t>2.1 四方目标（若仅两方合作，可删减）</w:t>
       </w:r>
     </w:p>
     <w:tbl>
@@ -1198,7 +721,7 @@
                 <w:b w:val="0"/>
                 <w:sz w:val="21"/>
               </w:rPr>
-              <w:t>强化「会念你、有温度」的品牌感知；获得有质量的情感内容资产；拉动联名期到店与套餐转化。</w:t>
+              <w:t>强化「会念你、有温度」；联名期到店与套餐转化；沉淀可复用内容资产。</w:t>
             </w:r>
           </w:p>
         </w:tc>
@@ -1232,94 +755,13 @@
                 <w:b w:val="0"/>
                 <w:sz w:val="21"/>
               </w:rPr>
-              <w:t>长尾期持续触达未观影或已观影人群；把「情书/侨批」从银幕延到日常；合规授权金句与物料。</w:t>
-            </w:r>
-          </w:p>
-        </w:tc>
-      </w:tr>
-      <w:tr>
-        <w:tc>
-          <w:tcPr>
-            <w:tcW w:type="dxa" w:w="4533"/>
-          </w:tcPr>
-          <w:p>
-            <w:r/>
-            <w:r>
-              <w:rPr>
-                <w:rFonts w:ascii="宋体" w:hAnsi="宋体" w:eastAsia="宋体"/>
-                <w:b w:val="0"/>
-                <w:sz w:val="21"/>
-              </w:rPr>
-              <w:t>消费者</w:t>
-            </w:r>
-          </w:p>
-        </w:tc>
-        <w:tc>
-          <w:tcPr>
-            <w:tcW w:type="dxa" w:w="4533"/>
-          </w:tcPr>
-          <w:p>
-            <w:r/>
-            <w:r>
-              <w:rPr>
-                <w:rFonts w:ascii="宋体" w:hAnsi="宋体" w:eastAsia="宋体"/>
-                <w:b w:val="0"/>
-                <w:sz w:val="21"/>
-              </w:rPr>
-              <w:t>获得一次不尴尬的惦记方式；可拍照、可带走、可投递的轻仪式。</w:t>
-            </w:r>
-          </w:p>
-        </w:tc>
-      </w:tr>
-      <w:tr>
-        <w:tc>
-          <w:tcPr>
-            <w:tcW w:type="dxa" w:w="4533"/>
-          </w:tcPr>
-          <w:p>
-            <w:r/>
-            <w:r>
-              <w:rPr>
-                <w:rFonts w:ascii="宋体" w:hAnsi="宋体" w:eastAsia="宋体"/>
-                <w:b w:val="0"/>
-                <w:sz w:val="21"/>
-              </w:rPr>
-              <w:t>内容/商业中介（若有）</w:t>
-            </w:r>
-          </w:p>
-        </w:tc>
-        <w:tc>
-          <w:tcPr>
-            <w:tcW w:type="dxa" w:w="4533"/>
-          </w:tcPr>
-          <w:p>
-            <w:r/>
-            <w:r>
-              <w:rPr>
-                <w:rFonts w:ascii="宋体" w:hAnsi="宋体" w:eastAsia="宋体"/>
-                <w:b w:val="0"/>
-                <w:sz w:val="21"/>
-              </w:rPr>
-              <w:t>可包装成可售卖的内容合作单元：专题、短片、沙龙、品牌内容包。</w:t>
+              <w:t>长尾触达；侨批/情书心智延展到日常；合规授权金句与物料。</w:t>
             </w:r>
           </w:p>
         </w:tc>
       </w:tr>
     </w:tbl>
     <w:p/>
-    <w:p>
-      <w:pPr>
-        <w:spacing w:before="200" w:after="160"/>
-      </w:pPr>
-      <w:r>
-        <w:rPr>
-          <w:rFonts w:ascii="黑体" w:hAnsi="黑体" w:eastAsia="黑体"/>
-          <w:b/>
-          <w:sz w:val="28"/>
-        </w:rPr>
-        <w:t>2.2 KPI（只写框架与对标逻辑，具体数字由品牌后台校准）</w:t>
-      </w:r>
-    </w:p>
     <w:tbl>
       <w:tblPr>
         <w:tblStyle w:val="TableGrid"/>
@@ -1344,7 +786,7 @@
                 <w:b/>
                 <w:sz w:val="22"/>
               </w:rPr>
-              <w:t>指标类型</w:t>
+              <w:t>指标</w:t>
             </w:r>
           </w:p>
         </w:tc>
@@ -1360,7 +802,7 @@
                 <w:b/>
                 <w:sz w:val="22"/>
               </w:rPr>
-              <w:t>建议监测项</w:t>
+              <w:t>监测项</w:t>
             </w:r>
           </w:p>
         </w:tc>
@@ -1410,7 +852,7 @@
                 <w:b w:val="0"/>
                 <w:sz w:val="21"/>
               </w:rPr>
-              <w:t>联名套餐杯量、套餐售罄时长、客单价变化、票根核销张数</w:t>
+              <w:t>联名杯量、套餐售罄节奏、票根核销</w:t>
             </w:r>
           </w:p>
         </w:tc>
@@ -1426,7 +868,7 @@
                 <w:b w:val="0"/>
                 <w:sz w:val="21"/>
               </w:rPr>
-              <w:t>不对媒体承诺虚高杯量</w:t>
+              <w:t>不对外承诺虚高数字</w:t>
             </w:r>
           </w:p>
         </w:tc>
@@ -1460,7 +902,7 @@
                 <w:b w:val="0"/>
                 <w:sz w:val="21"/>
               </w:rPr>
-              <w:t>主题店打卡量、快闪预约到店率、联名期门店排队相关UGC</w:t>
+              <w:t>主题店打卡、快闪到店</w:t>
             </w:r>
           </w:p>
         </w:tc>
@@ -1476,7 +918,7 @@
                 <w:b w:val="0"/>
                 <w:sz w:val="21"/>
               </w:rPr>
-              <w:t>对标喜茶过往主题店打卡逻辑</w:t>
+              <w:t>试点城市优先</w:t>
             </w:r>
           </w:p>
         </w:tc>
@@ -1510,7 +952,7 @@
                 <w:b w:val="0"/>
                 <w:sz w:val="21"/>
               </w:rPr>
-              <w:t>主话题阅读/讨论、二级话题、官方笔记互动、KOL投放ROI</w:t>
+              <w:t>#心中念你 及相关UGC</w:t>
             </w:r>
           </w:p>
         </w:tc>
@@ -1526,7 +968,7 @@
                 <w:b w:val="0"/>
                 <w:sz w:val="21"/>
               </w:rPr>
-              <w:t>以平台后台为准</w:t>
+              <w:t>以后台为准</w:t>
             </w:r>
           </w:p>
         </w:tc>
@@ -1560,7 +1002,7 @@
                 <w:b w:val="0"/>
                 <w:sz w:val="21"/>
               </w:rPr>
-              <w:t>联名相关评论情感倾向、「念你/阿嬷/家」关键词占比</w:t>
+              <w:t>温暖/思念/家相关声量</w:t>
             </w:r>
           </w:p>
         </w:tc>
@@ -1576,7 +1018,7 @@
                 <w:b w:val="0"/>
                 <w:sz w:val="21"/>
               </w:rPr>
-              <w:t>可用第三方监测</w:t>
+              <w:t>复盘用</w:t>
             </w:r>
           </w:p>
         </w:tc>
@@ -1593,39 +1035,12 @@
           <w:b/>
           <w:sz w:val="32"/>
         </w:rPr>
-        <w:t>三、核心策略与主题文案</w:t>
+        <w:t>三、核心策略与金句体系</w:t>
       </w:r>
     </w:p>
     <w:p>
       <w:pPr>
-        <w:spacing w:before="200" w:after="160"/>
-      </w:pPr>
-      <w:r>
-        <w:rPr>
-          <w:rFonts w:ascii="黑体" w:hAnsi="黑体" w:eastAsia="黑体"/>
-          <w:b/>
-          <w:sz w:val="28"/>
-        </w:rPr>
-        <w:t>3.1 洞察</w:t>
-      </w:r>
-    </w:p>
-    <w:p>
-      <w:pPr>
-        <w:spacing w:after="120" w:before="0" w:line="360" w:lineRule="auto"/>
-        <w:ind w:firstLine="420"/>
-      </w:pPr>
-      <w:r>
-        <w:rPr>
-          <w:rFonts w:ascii="宋体" w:hAnsi="宋体" w:eastAsia="宋体"/>
-          <w:b w:val="0"/>
-          <w:sz w:val="24"/>
-        </w:rPr>
-        <w:t>电影打动人的，往往不是一句「我爱你」，而是侨批里那些克制的话：报平安、念安康、纸短情长。今天的年轻人同样难当面说重话，却愿意在一杯茶、一条短句里停一下。</w:t>
-      </w:r>
-    </w:p>
-    <w:p>
-      <w:pPr>
-        <w:spacing w:after="120" w:before="0" w:line="360" w:lineRule="auto"/>
+        <w:spacing w:after="120" w:line="360" w:lineRule="auto"/>
         <w:ind w:firstLine="420"/>
       </w:pPr>
       <w:r>
@@ -1634,7 +1049,7 @@
           <w:b/>
           <w:sz w:val="24"/>
         </w:rPr>
-        <w:t>洞察一句话：</w:t>
+        <w:t>洞察：</w:t>
       </w:r>
       <w:r>
         <w:rPr>
@@ -1642,20 +1057,7 @@
           <w:b w:val="0"/>
           <w:sz w:val="24"/>
         </w:rPr>
-        <w:t>人们缺的不是更大的告白，而是一个被允许的、轻的「念你」。</w:t>
-      </w:r>
-    </w:p>
-    <w:p>
-      <w:pPr>
-        <w:spacing w:before="200" w:after="160"/>
-      </w:pPr>
-      <w:r>
-        <w:rPr>
-          <w:rFonts w:ascii="黑体" w:hAnsi="黑体" w:eastAsia="黑体"/>
-          <w:b/>
-          <w:sz w:val="28"/>
-        </w:rPr>
-        <w:t>3.2 主题体系（人话，非口号堆砌）</w:t>
+        <w:t>电影最动人的往往不是吼出「我爱你」，而是侨批里克制的惦记。联名卖的是被允许的、轻的「念你」。</w:t>
       </w:r>
     </w:p>
     <w:tbl>
@@ -1764,7 +1166,7 @@
                 <w:b w:val="0"/>
                 <w:sz w:val="21"/>
               </w:rPr>
-              <w:t>封面、对内项目名</w:t>
+              <w:t>对内/封面</w:t>
             </w:r>
           </w:p>
         </w:tc>
@@ -1814,7 +1216,7 @@
                 <w:b w:val="0"/>
                 <w:sz w:val="21"/>
               </w:rPr>
-              <w:t>主KV（拟授权使用/化用电影金句）</w:t>
+              <w:t>主KV（完整句见下，拟授权）</w:t>
             </w:r>
           </w:p>
         </w:tc>
@@ -1864,57 +1266,7 @@
                 <w:b w:val="0"/>
                 <w:sz w:val="21"/>
               </w:rPr>
-              <w:t>菜单主推款</w:t>
-            </w:r>
-          </w:p>
-        </w:tc>
-      </w:tr>
-      <w:tr>
-        <w:tc>
-          <w:tcPr>
-            <w:tcW w:type="dxa" w:w="3022"/>
-          </w:tcPr>
-          <w:p>
-            <w:r/>
-            <w:r>
-              <w:rPr>
-                <w:rFonts w:ascii="宋体" w:hAnsi="宋体" w:eastAsia="宋体"/>
-                <w:b w:val="0"/>
-                <w:sz w:val="21"/>
-              </w:rPr>
-              <w:t>副句（轮换）</w:t>
-            </w:r>
-          </w:p>
-        </w:tc>
-        <w:tc>
-          <w:tcPr>
-            <w:tcW w:type="dxa" w:w="3022"/>
-          </w:tcPr>
-          <w:p>
-            <w:r/>
-            <w:r>
-              <w:rPr>
-                <w:rFonts w:ascii="宋体" w:hAnsi="宋体" w:eastAsia="宋体"/>
-                <w:b w:val="0"/>
-                <w:sz w:val="21"/>
-              </w:rPr>
-              <w:t>念你安康。／切要平安。／纸短情长。</w:t>
-            </w:r>
-          </w:p>
-        </w:tc>
-        <w:tc>
-          <w:tcPr>
-            <w:tcW w:type="dxa" w:w="3022"/>
-          </w:tcPr>
-          <w:p>
-            <w:r/>
-            <w:r>
-              <w:rPr>
-                <w:rFonts w:ascii="宋体" w:hAnsi="宋体" w:eastAsia="宋体"/>
-                <w:b w:val="0"/>
-                <w:sz w:val="21"/>
-              </w:rPr>
-              <w:t>杯套内侧、小票、海报小字</w:t>
+              <w:t>菜单</w:t>
             </w:r>
           </w:p>
         </w:tc>
@@ -1964,7 +1316,7 @@
                 <w:b w:val="0"/>
                 <w:sz w:val="21"/>
               </w:rPr>
-              <w:t>店员话术、易拉宝</w:t>
+              <w:t>话术</w:t>
             </w:r>
           </w:p>
         </w:tc>
@@ -2014,35 +1366,13 @@
                 <w:b w:val="0"/>
                 <w:sz w:val="21"/>
               </w:rPr>
-              <w:t>信箱旁，扩参与、不改主题</w:t>
+              <w:t>信箱旁</w:t>
             </w:r>
           </w:p>
         </w:tc>
       </w:tr>
     </w:tbl>
     <w:p/>
-    <w:p>
-      <w:pPr>
-        <w:spacing w:after="120" w:before="0" w:line="360" w:lineRule="auto"/>
-        <w:ind w:firstLine="420"/>
-      </w:pPr>
-      <w:r>
-        <w:rPr>
-          <w:rFonts w:ascii="宋体" w:hAnsi="宋体" w:eastAsia="宋体"/>
-          <w:b/>
-          <w:sz w:val="24"/>
-        </w:rPr>
-        <w:t>授权提示：</w:t>
-      </w:r>
-      <w:r>
-        <w:rPr>
-          <w:rFonts w:ascii="宋体" w:hAnsi="宋体" w:eastAsia="宋体"/>
-          <w:b w:val="0"/>
-          <w:sz w:val="24"/>
-        </w:rPr>
-        <w:t>「心中念你，便不觉远」「切要平安」等若作主视觉，需电影/片方书面授权；未授权前对外可用化用短句「念你。」「先报平安。」并在物料标注联名关系。</w:t>
-      </w:r>
-    </w:p>
     <w:p>
       <w:pPr>
         <w:spacing w:before="200" w:after="160"/>
@@ -2053,12 +1383,12 @@
           <w:b/>
           <w:sz w:val="28"/>
         </w:rPr>
-        <w:t>3.3 为何不是「写给所有爱人」</w:t>
+        <w:t>3.1 拟授权金句池（轮换用于杯套内侧/海报小字/短视频字幕）</w:t>
       </w:r>
     </w:p>
     <w:p>
       <w:pPr>
-        <w:spacing w:after="120" w:before="0" w:line="360" w:lineRule="auto"/>
+        <w:spacing w:after="120" w:line="360" w:lineRule="auto"/>
         <w:ind w:firstLine="420"/>
       </w:pPr>
       <w:r>
@@ -2067,345 +1397,7 @@
           <w:b w:val="0"/>
           <w:sz w:val="24"/>
         </w:rPr>
-        <w:t>主锚仍是阿嬷/隔代惦记，与片名、侨批、已有联名心智一致。参与圈用门店说明柔扩，避免变成任何品牌都能做的泛爱营销。</w:t>
-      </w:r>
-    </w:p>
-    <w:p>
-      <w:pPr>
-        <w:spacing w:before="280" w:after="160"/>
-      </w:pPr>
-      <w:r>
-        <w:rPr>
-          <w:rFonts w:ascii="黑体" w:hAnsi="黑体" w:eastAsia="黑体"/>
-          <w:b/>
-          <w:sz w:val="32"/>
-        </w:rPr>
-        <w:t>四、联名产品设计</w:t>
-      </w:r>
-    </w:p>
-    <w:p>
-      <w:pPr>
-        <w:spacing w:before="200" w:after="160"/>
-      </w:pPr>
-      <w:r>
-        <w:rPr>
-          <w:rFonts w:ascii="黑体" w:hAnsi="黑体" w:eastAsia="黑体"/>
-          <w:b/>
-          <w:sz w:val="28"/>
-        </w:rPr>
-        <w:t>4.1 设计原则（落地关键句）</w:t>
-      </w:r>
-    </w:p>
-    <w:p>
-      <w:pPr>
-        <w:spacing w:after="120" w:before="0" w:line="360" w:lineRule="auto"/>
-        <w:ind w:firstLine="420"/>
-      </w:pPr>
-      <w:r>
-        <w:rPr>
-          <w:rFonts w:ascii="宋体" w:hAnsi="宋体" w:eastAsia="宋体"/>
-          <w:b/>
-          <w:sz w:val="24"/>
-        </w:rPr>
-        <w:t>产品不强调复杂原料创新，而强调熟悉感与情绪命名。</w:t>
-      </w:r>
-      <w:r>
-        <w:rPr>
-          <w:rFonts w:ascii="宋体" w:hAnsi="宋体" w:eastAsia="宋体"/>
-          <w:b w:val="0"/>
-          <w:sz w:val="24"/>
-        </w:rPr>
-        <w:t>优先调用喜茶现有成熟茶底、奶基底与小料系统，降低研发与供应链成本，提高上线效率；用命名、杯身与包材放大电影「念你／平安／纸短情长」的价值，使产品本身成为介质。</w:t>
-      </w:r>
-    </w:p>
-    <w:p>
-      <w:pPr>
-        <w:spacing w:after="120" w:before="0" w:line="360" w:lineRule="auto"/>
-        <w:ind w:firstLine="420"/>
-      </w:pPr>
-      <w:r>
-        <w:rPr>
-          <w:rFonts w:ascii="宋体" w:hAnsi="宋体" w:eastAsia="宋体"/>
-          <w:b/>
-          <w:sz w:val="24"/>
-        </w:rPr>
-        <w:t>与阿嬷手作「柑榄与单丛」的差异：</w:t>
-      </w:r>
-      <w:r>
-        <w:rPr>
-          <w:rFonts w:ascii="宋体" w:hAnsi="宋体" w:eastAsia="宋体"/>
-          <w:b w:val="0"/>
-          <w:sz w:val="24"/>
-        </w:rPr>
-        <w:t>对方强在地风物（橄榄、油柑、单丛），适合区域情感茶饮；喜茶全国门店更适合</w:t>
-      </w:r>
-      <w:r>
-        <w:rPr>
-          <w:rFonts w:ascii="宋体" w:hAnsi="宋体" w:eastAsia="宋体"/>
-          <w:b/>
-          <w:sz w:val="24"/>
-        </w:rPr>
-        <w:t>温和、好复购、易标准化</w:t>
-      </w:r>
-      <w:r>
-        <w:rPr>
-          <w:rFonts w:ascii="宋体" w:hAnsi="宋体" w:eastAsia="宋体"/>
-          <w:b w:val="0"/>
-          <w:sz w:val="24"/>
-        </w:rPr>
-        <w:t>的牛乳茶路径。若双方愿意做「彩蛋款」，可再议一款轻风物向（须供应链评估），不作主推必需。</w:t>
-      </w:r>
-    </w:p>
-    <w:p>
-      <w:pPr>
-        <w:spacing w:before="200" w:after="160"/>
-      </w:pPr>
-      <w:r>
-        <w:rPr>
-          <w:rFonts w:ascii="黑体" w:hAnsi="黑体" w:eastAsia="黑体"/>
-          <w:b/>
-          <w:sz w:val="28"/>
-        </w:rPr>
-        <w:t>4.2 产品方案</w:t>
-      </w:r>
-    </w:p>
-    <w:tbl>
-      <w:tblPr>
-        <w:tblStyle w:val="TableGrid"/>
-        <w:tblW w:type="auto" w:w="0"/>
-        <w:tblLook w:firstColumn="1" w:firstRow="1" w:lastColumn="0" w:lastRow="0" w:noHBand="0" w:noVBand="1" w:val="04A0"/>
-      </w:tblPr>
-      <w:tblGrid>
-        <w:gridCol w:w="2266"/>
-        <w:gridCol w:w="2266"/>
-        <w:gridCol w:w="2266"/>
-        <w:gridCol w:w="2266"/>
-      </w:tblGrid>
-      <w:tr>
-        <w:tc>
-          <w:tcPr>
-            <w:tcW w:type="dxa" w:w="2266"/>
-          </w:tcPr>
-          <w:p>
-            <w:r/>
-            <w:r>
-              <w:rPr>
-                <w:rFonts w:ascii="黑体" w:hAnsi="黑体" w:eastAsia="黑体"/>
-                <w:b/>
-                <w:sz w:val="22"/>
-              </w:rPr>
-              <w:t>款式</w:t>
-            </w:r>
-          </w:p>
-        </w:tc>
-        <w:tc>
-          <w:tcPr>
-            <w:tcW w:type="dxa" w:w="2266"/>
-          </w:tcPr>
-          <w:p>
-            <w:r/>
-            <w:r>
-              <w:rPr>
-                <w:rFonts w:ascii="黑体" w:hAnsi="黑体" w:eastAsia="黑体"/>
-                <w:b/>
-                <w:sz w:val="22"/>
-              </w:rPr>
-              <w:t>命名</w:t>
-            </w:r>
-          </w:p>
-        </w:tc>
-        <w:tc>
-          <w:tcPr>
-            <w:tcW w:type="dxa" w:w="2266"/>
-          </w:tcPr>
-          <w:p>
-            <w:r/>
-            <w:r>
-              <w:rPr>
-                <w:rFonts w:ascii="黑体" w:hAnsi="黑体" w:eastAsia="黑体"/>
-                <w:b/>
-                <w:sz w:val="22"/>
-              </w:rPr>
-              <w:t>方向</w:t>
-            </w:r>
-          </w:p>
-        </w:tc>
-        <w:tc>
-          <w:tcPr>
-            <w:tcW w:type="dxa" w:w="2266"/>
-          </w:tcPr>
-          <w:p>
-            <w:r/>
-            <w:r>
-              <w:rPr>
-                <w:rFonts w:ascii="黑体" w:hAnsi="黑体" w:eastAsia="黑体"/>
-                <w:b/>
-                <w:sz w:val="22"/>
-              </w:rPr>
-              <w:t>逻辑</w:t>
-            </w:r>
-          </w:p>
-        </w:tc>
-      </w:tr>
-      <w:tr>
-        <w:tc>
-          <w:tcPr>
-            <w:tcW w:type="dxa" w:w="2266"/>
-          </w:tcPr>
-          <w:p>
-            <w:r/>
-            <w:r>
-              <w:rPr>
-                <w:rFonts w:ascii="宋体" w:hAnsi="宋体" w:eastAsia="宋体"/>
-                <w:b w:val="0"/>
-                <w:sz w:val="21"/>
-              </w:rPr>
-              <w:t>主推</w:t>
-            </w:r>
-          </w:p>
-        </w:tc>
-        <w:tc>
-          <w:tcPr>
-            <w:tcW w:type="dxa" w:w="2266"/>
-          </w:tcPr>
-          <w:p>
-            <w:r/>
-            <w:r>
-              <w:rPr>
-                <w:rFonts w:ascii="宋体" w:hAnsi="宋体" w:eastAsia="宋体"/>
-                <w:b w:val="0"/>
-                <w:sz w:val="21"/>
-              </w:rPr>
-              <w:t>念你</w:t>
-            </w:r>
-          </w:p>
-        </w:tc>
-        <w:tc>
-          <w:tcPr>
-            <w:tcW w:type="dxa" w:w="2266"/>
-          </w:tcPr>
-          <w:p>
-            <w:r/>
-            <w:r>
-              <w:rPr>
-                <w:rFonts w:ascii="宋体" w:hAnsi="宋体" w:eastAsia="宋体"/>
-                <w:b w:val="0"/>
-                <w:sz w:val="21"/>
-              </w:rPr>
-              <w:t>焙香红茶 + 牛乳 + 黑糖波波/米麻薯等成熟小料（具体配方由喜茶研发定）</w:t>
-            </w:r>
-          </w:p>
-        </w:tc>
-        <w:tc>
-          <w:tcPr>
-            <w:tcW w:type="dxa" w:w="2266"/>
-          </w:tcPr>
-          <w:p>
-            <w:r/>
-            <w:r>
-              <w:rPr>
-                <w:rFonts w:ascii="宋体" w:hAnsi="宋体" w:eastAsia="宋体"/>
-                <w:b w:val="0"/>
-                <w:sz w:val="21"/>
-              </w:rPr>
-              <w:t>温暖、熟悉、好描述</w:t>
-            </w:r>
-          </w:p>
-        </w:tc>
-      </w:tr>
-      <w:tr>
-        <w:tc>
-          <w:tcPr>
-            <w:tcW w:type="dxa" w:w="2266"/>
-          </w:tcPr>
-          <w:p>
-            <w:r/>
-            <w:r>
-              <w:rPr>
-                <w:rFonts w:ascii="宋体" w:hAnsi="宋体" w:eastAsia="宋体"/>
-                <w:b w:val="0"/>
-                <w:sz w:val="21"/>
-              </w:rPr>
-              <w:t>备选</w:t>
-            </w:r>
-          </w:p>
-        </w:tc>
-        <w:tc>
-          <w:tcPr>
-            <w:tcW w:type="dxa" w:w="2266"/>
-          </w:tcPr>
-          <w:p>
-            <w:r/>
-            <w:r>
-              <w:rPr>
-                <w:rFonts w:ascii="宋体" w:hAnsi="宋体" w:eastAsia="宋体"/>
-                <w:b w:val="0"/>
-                <w:sz w:val="21"/>
-              </w:rPr>
-              <w:t>念你安康（轻乳）</w:t>
-            </w:r>
-          </w:p>
-        </w:tc>
-        <w:tc>
-          <w:tcPr>
-            <w:tcW w:type="dxa" w:w="2266"/>
-          </w:tcPr>
-          <w:p>
-            <w:r/>
-            <w:r>
-              <w:rPr>
-                <w:rFonts w:ascii="宋体" w:hAnsi="宋体" w:eastAsia="宋体"/>
-                <w:b w:val="0"/>
-                <w:sz w:val="21"/>
-              </w:rPr>
-              <w:t>桂花乌龙或清爽轻乳路线</w:t>
-            </w:r>
-          </w:p>
-        </w:tc>
-        <w:tc>
-          <w:tcPr>
-            <w:tcW w:type="dxa" w:w="2266"/>
-          </w:tcPr>
-          <w:p>
-            <w:r/>
-            <w:r>
-              <w:rPr>
-                <w:rFonts w:ascii="宋体" w:hAnsi="宋体" w:eastAsia="宋体"/>
-                <w:b w:val="0"/>
-                <w:sz w:val="21"/>
-              </w:rPr>
-              <w:t>春夏、偏女频传播</w:t>
-            </w:r>
-          </w:p>
-        </w:tc>
-      </w:tr>
-    </w:tbl>
-    <w:p/>
-    <w:p>
-      <w:pPr>
-        <w:spacing w:after="120" w:before="0" w:line="360" w:lineRule="auto"/>
-        <w:ind w:firstLine="420"/>
-      </w:pPr>
-      <w:r>
-        <w:rPr>
-          <w:rFonts w:ascii="宋体" w:hAnsi="宋体" w:eastAsia="宋体"/>
-          <w:b w:val="0"/>
-          <w:sz w:val="24"/>
-        </w:rPr>
-        <w:t>菜单描述示例（人话）：念你——喝起来像一句没说重的惦记。</w:t>
-      </w:r>
-    </w:p>
-    <w:p>
-      <w:pPr>
-        <w:spacing w:before="200" w:after="160"/>
-      </w:pPr>
-      <w:r>
-        <w:rPr>
-          <w:rFonts w:ascii="黑体" w:hAnsi="黑体" w:eastAsia="黑体"/>
-          <w:b/>
-          <w:sz w:val="28"/>
-        </w:rPr>
-        <w:t>4.3 定价与机制（原则，非杜撰价）</w:t>
+        <w:t>以下均来自影片及相关公开报道中被广泛引用的侨批气质文句，正式投放前须经片方书面授权：</w:t>
       </w:r>
     </w:p>
     <w:p>
@@ -2419,7 +1411,7 @@
           <w:b w:val="0"/>
           <w:sz w:val="24"/>
         </w:rPr>
-        <w:t>定价落入喜茶常规联名套餐带（以品牌现行价格带为准，本稿不编造具体价格）。</w:t>
+        <w:t>江海万里，心中念你，便不觉遥远。</w:t>
       </w:r>
     </w:p>
     <w:p>
@@ -2433,7 +1425,7 @@
           <w:b w:val="0"/>
           <w:sz w:val="24"/>
         </w:rPr>
-        <w:t>建议保留「票根福利」：凭《给阿嬷的情书》票根购买联名款，赠家书卡或贴纸——机制已有公开先例（阿嬷手作票根优惠报道）。</w:t>
+        <w:t>暹罗虽远，心有所寄，身若比邻。</w:t>
       </w:r>
     </w:p>
     <w:p>
@@ -2447,47 +1439,7 @@
           <w:b w:val="0"/>
           <w:sz w:val="24"/>
         </w:rPr>
-        <w:t>周边套餐：低成本明信片/贴纸随套餐；搪瓷杯等作为加价购或限量，控制SKU。</w:t>
-      </w:r>
-    </w:p>
-    <w:p>
-      <w:pPr>
-        <w:spacing w:before="280" w:after="160"/>
-      </w:pPr>
-      <w:r>
-        <w:rPr>
-          <w:rFonts w:ascii="黑体" w:hAnsi="黑体" w:eastAsia="黑体"/>
-          <w:b/>
-          <w:sz w:val="32"/>
-        </w:rPr>
-        <w:t>五、包材与门店触点</w:t>
-      </w:r>
-    </w:p>
-    <w:p>
-      <w:pPr>
-        <w:spacing w:after="120" w:before="0" w:line="360" w:lineRule="auto"/>
-        <w:ind w:firstLine="420"/>
-      </w:pPr>
-      <w:r>
-        <w:rPr>
-          <w:rFonts w:ascii="宋体" w:hAnsi="宋体" w:eastAsia="宋体"/>
-          <w:b w:val="0"/>
-          <w:sz w:val="24"/>
-        </w:rPr>
-        <w:t>电影联名的高潮往往在触点，不在发明口味。</w:t>
-      </w:r>
-    </w:p>
-    <w:p>
-      <w:pPr>
-        <w:spacing w:before="200" w:after="160"/>
-      </w:pPr>
-      <w:r>
-        <w:rPr>
-          <w:rFonts w:ascii="黑体" w:hAnsi="黑体" w:eastAsia="黑体"/>
-          <w:b/>
-          <w:sz w:val="28"/>
-        </w:rPr>
-        <w:t>5.1 杯套</w:t>
+        <w:t>纸短情长，伏惟珍重。</w:t>
       </w:r>
     </w:p>
     <w:p>
@@ -2501,7 +1453,7 @@
           <w:b w:val="0"/>
           <w:sz w:val="24"/>
         </w:rPr>
-        <w:t>外侧：心中念你，便不觉远。（或「念你」大字）</w:t>
+        <w:t>切要平安，即为团圆。</w:t>
       </w:r>
     </w:p>
     <w:p>
@@ -2515,20 +1467,7 @@
           <w:b w:val="0"/>
           <w:sz w:val="24"/>
         </w:rPr>
-        <w:t>内侧短句轮换（示例，需过审）：念你安康。／切要平安。／纸短情长。／展信安康（若授权）。</w:t>
-      </w:r>
-    </w:p>
-    <w:p>
-      <w:pPr>
-        <w:spacing w:before="200" w:after="160"/>
-      </w:pPr>
-      <w:r>
-        <w:rPr>
-          <w:rFonts w:ascii="黑体" w:hAnsi="黑体" w:eastAsia="黑体"/>
-          <w:b/>
-          <w:sz w:val="28"/>
-        </w:rPr>
-        <w:t>5.2 小票</w:t>
+        <w:t>江海有岸，团圆可盼。</w:t>
       </w:r>
     </w:p>
     <w:p>
@@ -2542,89 +1481,51 @@
           <w:b w:val="0"/>
           <w:sz w:val="24"/>
         </w:rPr>
-        <w:t>底部一行：喝完，给家里报个平安。／念你安康。</w:t>
+        <w:t>展信安康。</w:t>
       </w:r>
     </w:p>
     <w:p>
       <w:pPr>
-        <w:spacing w:before="200" w:after="160"/>
+        <w:spacing w:after="120" w:line="360" w:lineRule="auto"/>
+        <w:ind w:firstLine="420"/>
       </w:pPr>
       <w:r>
         <w:rPr>
-          <w:rFonts w:ascii="黑体" w:hAnsi="黑体" w:eastAsia="黑体"/>
+          <w:rFonts w:ascii="宋体" w:hAnsi="宋体" w:eastAsia="宋体"/>
           <w:b/>
-          <w:sz w:val="28"/>
+          <w:sz w:val="24"/>
         </w:rPr>
-        <w:t>5.3 重点门店「念你信箱」</w:t>
+        <w:t>使用建议：</w:t>
       </w:r>
-    </w:p>
-    <w:p>
-      <w:pPr>
-        <w:pStyle w:val="ListBullet"/>
-        <w:spacing w:line="360" w:lineRule="auto"/>
-      </w:pPr>
       <w:r>
         <w:rPr>
           <w:rFonts w:ascii="宋体" w:hAnsi="宋体" w:eastAsia="宋体"/>
           <w:b w:val="0"/>
           <w:sz w:val="24"/>
         </w:rPr>
-        <w:t>购联名款可领一张短笺：可带走、可贴墙、可投入信箱。</w:t>
+        <w:t>主KV固定「心中念你，便不觉远。」（可由完整句「……便不觉遥远」精炼，以授权文本为准）；其余五句做随机杯套/小票轮换，避免审美疲劳，也更像「一封封不同的批」。</w:t>
       </w:r>
     </w:p>
     <w:p>
       <w:pPr>
-        <w:pStyle w:val="ListBullet"/>
-        <w:spacing w:line="360" w:lineRule="auto"/>
+        <w:spacing w:after="120" w:line="360" w:lineRule="auto"/>
+        <w:ind w:firstLine="420"/>
       </w:pPr>
+      <w:r>
+        <w:rPr>
+          <w:rFonts w:ascii="宋体" w:hAnsi="宋体" w:eastAsia="宋体"/>
+          <w:b/>
+          <w:sz w:val="24"/>
+        </w:rPr>
+        <w:t>未授权时的替补：</w:t>
+      </w:r>
       <w:r>
         <w:rPr>
           <w:rFonts w:ascii="宋体" w:hAnsi="宋体" w:eastAsia="宋体"/>
           <w:b w:val="0"/>
           <w:sz w:val="24"/>
         </w:rPr>
-        <w:t>不强制只写阿嬷：写给阿嬷/长辈/心里惦记的人。</w:t>
-      </w:r>
-    </w:p>
-    <w:p>
-      <w:pPr>
-        <w:pStyle w:val="ListBullet"/>
-        <w:spacing w:line="360" w:lineRule="auto"/>
-      </w:pPr>
-      <w:r>
-        <w:rPr>
-          <w:rFonts w:ascii="宋体" w:hAnsi="宋体" w:eastAsia="宋体"/>
-          <w:b w:val="0"/>
-          <w:sz w:val="24"/>
-        </w:rPr>
-        <w:t>执行：先10–20家商场大店/旗舰店，不全国硬装改造。</w:t>
-      </w:r>
-    </w:p>
-    <w:p>
-      <w:pPr>
-        <w:spacing w:before="200" w:after="160"/>
-      </w:pPr>
-      <w:r>
-        <w:rPr>
-          <w:rFonts w:ascii="黑体" w:hAnsi="黑体" w:eastAsia="黑体"/>
-          <w:b/>
-          <w:sz w:val="28"/>
-        </w:rPr>
-        <w:t>5.4 「代写一杯」（贴南枝线，可选）</w:t>
-      </w:r>
-    </w:p>
-    <w:p>
-      <w:pPr>
-        <w:spacing w:after="120" w:before="0" w:line="360" w:lineRule="auto"/>
-        <w:ind w:firstLine="420"/>
-      </w:pPr>
-      <w:r>
-        <w:rPr>
-          <w:rFonts w:ascii="宋体" w:hAnsi="宋体" w:eastAsia="宋体"/>
-          <w:b w:val="0"/>
-          <w:sz w:val="24"/>
-        </w:rPr>
-        <w:t>两人同行，可请店员协助在杯套内侧印/贴一句「替他说」。呼应电影里代写代寄的情义，降低「我写不出来」的门槛。</w:t>
+        <w:t>对外主视觉用「念你。」「先报平安。」仍清晰联名，不盗用原句。</w:t>
       </w:r>
     </w:p>
     <w:p>
@@ -2637,115 +1538,29 @@
           <w:b/>
           <w:sz w:val="32"/>
         </w:rPr>
-        <w:t>六、线下与观影联动</w:t>
+        <w:t>四、联名产品</w:t>
       </w:r>
     </w:p>
     <w:p>
       <w:pPr>
-        <w:spacing w:before="200" w:after="160"/>
+        <w:spacing w:after="120" w:line="360" w:lineRule="auto"/>
+        <w:ind w:firstLine="420"/>
       </w:pPr>
       <w:r>
         <w:rPr>
-          <w:rFonts w:ascii="黑体" w:hAnsi="黑体" w:eastAsia="黑体"/>
+          <w:rFonts w:ascii="宋体" w:hAnsi="宋体" w:eastAsia="宋体"/>
           <w:b/>
-          <w:sz w:val="28"/>
+          <w:sz w:val="24"/>
         </w:rPr>
-        <w:t>6.1 轻快闪：收批处（1–2城即可）</w:t>
+        <w:t>原则：</w:t>
       </w:r>
-    </w:p>
-    <w:p>
-      <w:pPr>
-        <w:spacing w:after="120" w:before="0" w:line="360" w:lineRule="auto"/>
-        <w:ind w:firstLine="420"/>
-      </w:pPr>
       <w:r>
         <w:rPr>
           <w:rFonts w:ascii="宋体" w:hAnsi="宋体" w:eastAsia="宋体"/>
           <w:b w:val="0"/>
           <w:sz w:val="24"/>
         </w:rPr>
-        <w:t>场景：小信箱、木桌、台灯、家书墙——不做沉重「南洋剧情馆」。城市建议上海（媒体）、广州或深圳（饮茶与情感接受度高）。拍照打卡发布主话题可抽官方二创。</w:t>
-      </w:r>
-    </w:p>
-    <w:p>
-      <w:pPr>
-        <w:spacing w:before="200" w:after="160"/>
-      </w:pPr>
-      <w:r>
-        <w:rPr>
-          <w:rFonts w:ascii="黑体" w:hAnsi="黑体" w:eastAsia="黑体"/>
-          <w:b/>
-          <w:sz w:val="28"/>
-        </w:rPr>
-        <w:t>6.2 观影票根路径（强烈建议保留）</w:t>
-      </w:r>
-    </w:p>
-    <w:p>
-      <w:pPr>
-        <w:spacing w:after="120" w:before="0" w:line="360" w:lineRule="auto"/>
-        <w:ind w:firstLine="420"/>
-      </w:pPr>
-      <w:r>
-        <w:rPr>
-          <w:rFonts w:ascii="宋体" w:hAnsi="宋体" w:eastAsia="宋体"/>
-          <w:b w:val="0"/>
-          <w:sz w:val="24"/>
-        </w:rPr>
-        <w:t>影院完成情感唤起 → 票根作为接力 → 喜茶门店承接余韵。这是阿嬷手作案例里被反复讨论的有效结构，全国连锁更能放大核销面。</w:t>
-      </w:r>
-    </w:p>
-    <w:p>
-      <w:pPr>
-        <w:spacing w:before="200" w:after="160"/>
-      </w:pPr>
-      <w:r>
-        <w:rPr>
-          <w:rFonts w:ascii="黑体" w:hAnsi="黑体" w:eastAsia="黑体"/>
-          <w:b/>
-          <w:sz w:val="28"/>
-        </w:rPr>
-        <w:t>6.3 不建议</w:t>
-      </w:r>
-    </w:p>
-    <w:p>
-      <w:pPr>
-        <w:pStyle w:val="ListBullet"/>
-        <w:spacing w:line="360" w:lineRule="auto"/>
-      </w:pPr>
-      <w:r>
-        <w:rPr>
-          <w:rFonts w:ascii="宋体" w:hAnsi="宋体" w:eastAsia="宋体"/>
-          <w:b w:val="0"/>
-          <w:sz w:val="24"/>
-        </w:rPr>
-        <w:t>全国同步重装「阿嬷家客厅」。</w:t>
-      </w:r>
-    </w:p>
-    <w:p>
-      <w:pPr>
-        <w:pStyle w:val="ListBullet"/>
-        <w:spacing w:line="360" w:lineRule="auto"/>
-      </w:pPr>
-      <w:r>
-        <w:rPr>
-          <w:rFonts w:ascii="宋体" w:hAnsi="宋体" w:eastAsia="宋体"/>
-          <w:b w:val="0"/>
-          <w:sz w:val="24"/>
-        </w:rPr>
-        <w:t>多城大规模快闪同时铺开（预算与控场风险高）。</w:t>
-      </w:r>
-    </w:p>
-    <w:p>
-      <w:pPr>
-        <w:spacing w:before="280" w:after="160"/>
-      </w:pPr>
-      <w:r>
-        <w:rPr>
-          <w:rFonts w:ascii="黑体" w:hAnsi="黑体" w:eastAsia="黑体"/>
-          <w:b/>
-          <w:sz w:val="32"/>
-        </w:rPr>
-        <w:t>七、周边</w:t>
+        <w:t>不强调复杂原料创新，强调熟悉感与情绪命名；复用喜茶成熟茶底与小料，提高落地效率。与阿嬷手作「柑榄与单丛」差异化：对方强在地风物，喜茶走全国可标准化的牛乳茶「念你」。</w:t>
       </w:r>
     </w:p>
     <w:tbl>
@@ -2772,7 +1587,7 @@
                 <w:b/>
                 <w:sz w:val="22"/>
               </w:rPr>
-              <w:t>优先级</w:t>
+              <w:t>款式</w:t>
             </w:r>
           </w:p>
         </w:tc>
@@ -2788,7 +1603,7 @@
                 <w:b/>
                 <w:sz w:val="22"/>
               </w:rPr>
-              <w:t>物品</w:t>
+              <w:t>命名</w:t>
             </w:r>
           </w:p>
         </w:tc>
@@ -2804,7 +1619,7 @@
                 <w:b/>
                 <w:sz w:val="22"/>
               </w:rPr>
-              <w:t>理由</w:t>
+              <w:t>方向</w:t>
             </w:r>
           </w:p>
         </w:tc>
@@ -2822,7 +1637,7 @@
                 <w:b w:val="0"/>
                 <w:sz w:val="21"/>
               </w:rPr>
-              <w:t>必做</w:t>
+              <w:t>主推</w:t>
             </w:r>
           </w:p>
         </w:tc>
@@ -2838,7 +1653,7 @@
                 <w:b w:val="0"/>
                 <w:sz w:val="21"/>
               </w:rPr>
-              <w:t>家书明信片/短笺套组</w:t>
+              <w:t>念你</w:t>
             </w:r>
           </w:p>
         </w:tc>
@@ -2854,7 +1669,7 @@
                 <w:b w:val="0"/>
                 <w:sz w:val="21"/>
               </w:rPr>
-              <w:t>低成本、强贴片、易UGC；对标侨批卡逻辑</w:t>
+              <w:t>焙香红茶+牛乳+成熟小料（配方由喜茶研发定）</w:t>
             </w:r>
           </w:p>
         </w:tc>
@@ -2872,7 +1687,7 @@
                 <w:b w:val="0"/>
                 <w:sz w:val="21"/>
               </w:rPr>
-              <w:t>必做</w:t>
+              <w:t>备选</w:t>
             </w:r>
           </w:p>
         </w:tc>
@@ -2888,7 +1703,7 @@
                 <w:b w:val="0"/>
                 <w:sz w:val="21"/>
               </w:rPr>
-              <w:t>贴纸包</w:t>
+              <w:t>念你安康</w:t>
             </w:r>
           </w:p>
         </w:tc>
@@ -2904,113 +1719,41 @@
                 <w:b w:val="0"/>
                 <w:sz w:val="21"/>
               </w:rPr>
-              <w:t>低成本赠品</w:t>
-            </w:r>
-          </w:p>
-        </w:tc>
-      </w:tr>
-      <w:tr>
-        <w:tc>
-          <w:tcPr>
-            <w:tcW w:type="dxa" w:w="3022"/>
-          </w:tcPr>
-          <w:p>
-            <w:r/>
-            <w:r>
-              <w:rPr>
-                <w:rFonts w:ascii="宋体" w:hAnsi="宋体" w:eastAsia="宋体"/>
-                <w:b w:val="0"/>
-                <w:sz w:val="21"/>
-              </w:rPr>
-              <w:t>可选</w:t>
-            </w:r>
-          </w:p>
-        </w:tc>
-        <w:tc>
-          <w:tcPr>
-            <w:tcW w:type="dxa" w:w="3022"/>
-          </w:tcPr>
-          <w:p>
-            <w:r/>
-            <w:r>
-              <w:rPr>
-                <w:rFonts w:ascii="宋体" w:hAnsi="宋体" w:eastAsia="宋体"/>
-                <w:b w:val="0"/>
-                <w:sz w:val="21"/>
-              </w:rPr>
-              <w:t>搪瓷杯/玻璃杯（印「念你」）</w:t>
-            </w:r>
-          </w:p>
-        </w:tc>
-        <w:tc>
-          <w:tcPr>
-            <w:tcW w:type="dxa" w:w="3022"/>
-          </w:tcPr>
-          <w:p>
-            <w:r/>
-            <w:r>
-              <w:rPr>
-                <w:rFonts w:ascii="宋体" w:hAnsi="宋体" w:eastAsia="宋体"/>
-                <w:b w:val="0"/>
-                <w:sz w:val="21"/>
-              </w:rPr>
-              <w:t>收藏向加价购</w:t>
-            </w:r>
-          </w:p>
-        </w:tc>
-      </w:tr>
-      <w:tr>
-        <w:tc>
-          <w:tcPr>
-            <w:tcW w:type="dxa" w:w="3022"/>
-          </w:tcPr>
-          <w:p>
-            <w:r/>
-            <w:r>
-              <w:rPr>
-                <w:rFonts w:ascii="宋体" w:hAnsi="宋体" w:eastAsia="宋体"/>
-                <w:b w:val="0"/>
-                <w:sz w:val="21"/>
-              </w:rPr>
-              <w:t>不做</w:t>
-            </w:r>
-          </w:p>
-        </w:tc>
-        <w:tc>
-          <w:tcPr>
-            <w:tcW w:type="dxa" w:w="3022"/>
-          </w:tcPr>
-          <w:p>
-            <w:r/>
-            <w:r>
-              <w:rPr>
-                <w:rFonts w:ascii="宋体" w:hAnsi="宋体" w:eastAsia="宋体"/>
-                <w:b w:val="0"/>
-                <w:sz w:val="21"/>
-              </w:rPr>
-              <w:t>与电影弱相关的杂货造型挂件</w:t>
-            </w:r>
-          </w:p>
-        </w:tc>
-        <w:tc>
-          <w:tcPr>
-            <w:tcW w:type="dxa" w:w="3022"/>
-          </w:tcPr>
-          <w:p>
-            <w:r/>
-            <w:r>
-              <w:rPr>
-                <w:rFonts w:ascii="宋体" w:hAnsi="宋体" w:eastAsia="宋体"/>
-                <w:b w:val="0"/>
-                <w:sz w:val="21"/>
-              </w:rPr>
-              <w:t>稀释IP，增加库存风险</w:t>
+              <w:t>桂花乌龙/清爽轻乳，偏春夏</w:t>
             </w:r>
           </w:p>
         </w:tc>
       </w:tr>
     </w:tbl>
     <w:p/>
+    <w:p>
+      <w:pPr>
+        <w:pStyle w:val="ListBullet"/>
+        <w:spacing w:line="360" w:lineRule="auto"/>
+      </w:pPr>
+      <w:r>
+        <w:rPr>
+          <w:rFonts w:ascii="宋体" w:hAnsi="宋体" w:eastAsia="宋体"/>
+          <w:b w:val="0"/>
+          <w:sz w:val="24"/>
+        </w:rPr>
+        <w:t>定价落入喜茶现行联名套餐带（本稿不编造价格）。</w:t>
+      </w:r>
+    </w:p>
+    <w:p>
+      <w:pPr>
+        <w:pStyle w:val="ListBullet"/>
+        <w:spacing w:line="360" w:lineRule="auto"/>
+      </w:pPr>
+      <w:r>
+        <w:rPr>
+          <w:rFonts w:ascii="宋体" w:hAnsi="宋体" w:eastAsia="宋体"/>
+          <w:b w:val="0"/>
+          <w:sz w:val="24"/>
+        </w:rPr>
+        <w:t>票根机制：凭电影票根购联名款赠家书卡/贴纸——先试点核销，再视数据扩面。</w:t>
+      </w:r>
+    </w:p>
     <w:p>
       <w:pPr>
         <w:spacing w:before="280" w:after="160"/>
@@ -3021,7 +1764,90 @@
           <w:b/>
           <w:sz w:val="32"/>
         </w:rPr>
-        <w:t>八、传播策略</w:t>
+        <w:t>五、包材与门店触点</w:t>
+      </w:r>
+    </w:p>
+    <w:p>
+      <w:pPr>
+        <w:pStyle w:val="ListBullet"/>
+        <w:spacing w:line="360" w:lineRule="auto"/>
+      </w:pPr>
+      <w:r>
+        <w:rPr>
+          <w:rFonts w:ascii="宋体" w:hAnsi="宋体" w:eastAsia="宋体"/>
+          <w:b w:val="0"/>
+          <w:sz w:val="24"/>
+        </w:rPr>
+        <w:t>杯套外侧：心中念你，便不觉远。／念你</w:t>
+      </w:r>
+    </w:p>
+    <w:p>
+      <w:pPr>
+        <w:pStyle w:val="ListBullet"/>
+        <w:spacing w:line="360" w:lineRule="auto"/>
+      </w:pPr>
+      <w:r>
+        <w:rPr>
+          <w:rFonts w:ascii="宋体" w:hAnsi="宋体" w:eastAsia="宋体"/>
+          <w:b w:val="0"/>
+          <w:sz w:val="24"/>
+        </w:rPr>
+        <w:t>杯套内侧：金句池随机一句</w:t>
+      </w:r>
+    </w:p>
+    <w:p>
+      <w:pPr>
+        <w:pStyle w:val="ListBullet"/>
+        <w:spacing w:line="360" w:lineRule="auto"/>
+      </w:pPr>
+      <w:r>
+        <w:rPr>
+          <w:rFonts w:ascii="宋体" w:hAnsi="宋体" w:eastAsia="宋体"/>
+          <w:b w:val="0"/>
+          <w:sz w:val="24"/>
+        </w:rPr>
+        <w:t>小票：喝完，给家里报个平安。／念你安康。</w:t>
+      </w:r>
+    </w:p>
+    <w:p>
+      <w:pPr>
+        <w:pStyle w:val="ListBullet"/>
+        <w:spacing w:line="360" w:lineRule="auto"/>
+      </w:pPr>
+      <w:r>
+        <w:rPr>
+          <w:rFonts w:ascii="宋体" w:hAnsi="宋体" w:eastAsia="宋体"/>
+          <w:b w:val="0"/>
+          <w:sz w:val="24"/>
+        </w:rPr>
+        <w:t>重点店「念你信箱」+短笺（可带走/可贴/可投）</w:t>
+      </w:r>
+    </w:p>
+    <w:p>
+      <w:pPr>
+        <w:pStyle w:val="ListBullet"/>
+        <w:spacing w:line="360" w:lineRule="auto"/>
+      </w:pPr>
+      <w:r>
+        <w:rPr>
+          <w:rFonts w:ascii="宋体" w:hAnsi="宋体" w:eastAsia="宋体"/>
+          <w:b w:val="0"/>
+          <w:sz w:val="24"/>
+        </w:rPr>
+        <w:t>可选「代写一杯」：呼应南枝代寄，降低书写门槛</w:t>
+      </w:r>
+    </w:p>
+    <w:p>
+      <w:pPr>
+        <w:spacing w:before="280" w:after="160"/>
+      </w:pPr>
+      <w:r>
+        <w:rPr>
+          <w:rFonts w:ascii="黑体" w:hAnsi="黑体" w:eastAsia="黑体"/>
+          <w:b/>
+          <w:sz w:val="32"/>
+        </w:rPr>
+        <w:t>六、线下、试点与档期建议</w:t>
       </w:r>
     </w:p>
     <w:p>
@@ -3034,34 +1860,29 @@
           <w:b/>
           <w:sz w:val="28"/>
         </w:rPr>
-        <w:t>8.1 总原则</w:t>
+        <w:t>6.1 试点范围（主策略）</w:t>
       </w:r>
     </w:p>
     <w:p>
       <w:pPr>
-        <w:spacing w:after="120" w:before="0" w:line="360" w:lineRule="auto"/>
+        <w:spacing w:after="120" w:line="360" w:lineRule="auto"/>
         <w:ind w:firstLine="420"/>
       </w:pPr>
+      <w:r>
+        <w:rPr>
+          <w:rFonts w:ascii="宋体" w:hAnsi="宋体" w:eastAsia="宋体"/>
+          <w:b/>
+          <w:sz w:val="24"/>
+        </w:rPr>
+        <w:t>先试点，再扩面。</w:t>
+      </w:r>
       <w:r>
         <w:rPr>
           <w:rFonts w:ascii="宋体" w:hAnsi="宋体" w:eastAsia="宋体"/>
           <w:b w:val="0"/>
           <w:sz w:val="24"/>
         </w:rPr>
-        <w:t>不追「好喝测评」做唯一主线，而追「我念了谁」的真实句子。短视频镜头：捧杯、写短笺、投信箱、票根与杯并置。</w:t>
-      </w:r>
-    </w:p>
-    <w:p>
-      <w:pPr>
-        <w:spacing w:before="200" w:after="160"/>
-      </w:pPr>
-      <w:r>
-        <w:rPr>
-          <w:rFonts w:ascii="黑体" w:hAnsi="黑体" w:eastAsia="黑体"/>
-          <w:b/>
-          <w:sz w:val="28"/>
-        </w:rPr>
-        <w:t>8.2 节奏</w:t>
+        <w:t>建议第一期：华南（广州/深圳，贴近潮汕文化共鸣与饮茶习惯）+ 上海或北京择一（媒体与内容扩散）。门店选商场大店/旗舰/LAB。主题店氛围以桌贴门贴、信箱、海报为主，不做全国硬装。</w:t>
       </w:r>
     </w:p>
     <w:tbl>
@@ -3087,7 +1908,7 @@
                 <w:b/>
                 <w:sz w:val="22"/>
               </w:rPr>
-              <w:t>阶段</w:t>
+              <w:t>试点内容</w:t>
             </w:r>
           </w:p>
         </w:tc>
@@ -3103,7 +1924,7 @@
                 <w:b/>
                 <w:sz w:val="22"/>
               </w:rPr>
-              <w:t>动作</w:t>
+              <w:t>建议</w:t>
             </w:r>
           </w:p>
         </w:tc>
@@ -3121,7 +1942,7 @@
                 <w:b w:val="0"/>
                 <w:sz w:val="21"/>
               </w:rPr>
-              <w:t>预热</w:t>
+              <w:t>主题氛围店</w:t>
             </w:r>
           </w:p>
         </w:tc>
@@ -3137,7 +1958,7 @@
                 <w:b w:val="0"/>
                 <w:sz w:val="21"/>
               </w:rPr>
-              <w:t>喜茶×电影双官号预告；释出海报句「心中念你，便不觉远。」；征集「一句念你」短文案</w:t>
+              <w:t>每城5–10家量级（具体由喜茶门店评估）</w:t>
             </w:r>
           </w:p>
         </w:tc>
@@ -3155,7 +1976,7 @@
                 <w:b w:val="0"/>
                 <w:sz w:val="21"/>
               </w:rPr>
-              <w:t>爆发</w:t>
+              <w:t>轻快闪「收批处」</w:t>
             </w:r>
           </w:p>
         </w:tc>
@@ -3171,7 +1992,7 @@
                 <w:b w:val="0"/>
                 <w:sz w:val="21"/>
               </w:rPr>
-              <w:t>门店实拍、写信过程、KOL（情感/生活方式/电影/探店）；主话题#心中念你；副话题#念你安康</w:t>
+              <w:t>0–1个（上海或深圳），非必须</w:t>
             </w:r>
           </w:p>
         </w:tc>
@@ -3189,7 +2010,7 @@
                 <w:b w:val="0"/>
                 <w:sz w:val="21"/>
               </w:rPr>
-              <w:t>长尾</w:t>
+              <w:t>票根核销</w:t>
             </w:r>
           </w:p>
         </w:tc>
@@ -3205,7 +2026,7 @@
                 <w:b w:val="0"/>
                 <w:sz w:val="21"/>
               </w:rPr>
-              <w:t>精选用户句子做二创长图/H5「许多句念你」；与电影长尾、重映或衍生节点再借势</w:t>
+              <w:t>仅试点城市门店开通，后台统计核销率后再决定是否全国</w:t>
             </w:r>
           </w:p>
         </w:tc>
@@ -3222,12 +2043,12 @@
           <w:b/>
           <w:sz w:val="28"/>
         </w:rPr>
-        <w:t>8.3 与三联气质的接合点（若提案面向媒体商业岗）</w:t>
+        <w:t>6.2 档期：无强制节点，以下为可选建议（不作为主轴）</w:t>
       </w:r>
     </w:p>
     <w:p>
       <w:pPr>
-        <w:spacing w:after="120" w:before="0" w:line="360" w:lineRule="auto"/>
+        <w:spacing w:after="120" w:line="360" w:lineRule="auto"/>
         <w:ind w:firstLine="420"/>
       </w:pPr>
       <w:r>
@@ -3236,7 +2057,284 @@
           <w:b w:val="0"/>
           <w:sz w:val="24"/>
         </w:rPr>
-        <w:t>可延展为人物故事向内容：用户短笺精选、侨批文化短讲、主创对谈——偏真实情感与文化记忆，而非纯促销信息流。具体是否由三联承接，待确认提案立场。</w:t>
+        <w:t>目前无既定上线档期。电影已过点映与主宣高峰，更适合「长尾情感」合作。下列窗口仅供排期讨论，可删可换，不绑定本案成立：</w:t>
+      </w:r>
+    </w:p>
+    <w:tbl>
+      <w:tblPr>
+        <w:tblStyle w:val="TableGrid"/>
+        <w:tblW w:type="auto" w:w="0"/>
+        <w:tblLook w:firstColumn="1" w:firstRow="1" w:lastColumn="0" w:lastRow="0" w:noHBand="0" w:noVBand="1" w:val="04A0"/>
+      </w:tblPr>
+      <w:tblGrid>
+        <w:gridCol w:w="3022"/>
+        <w:gridCol w:w="3022"/>
+        <w:gridCol w:w="3022"/>
+      </w:tblGrid>
+      <w:tr>
+        <w:tc>
+          <w:tcPr>
+            <w:tcW w:type="dxa" w:w="3022"/>
+          </w:tcPr>
+          <w:p>
+            <w:r/>
+            <w:r>
+              <w:rPr>
+                <w:rFonts w:ascii="黑体" w:hAnsi="黑体" w:eastAsia="黑体"/>
+                <w:b/>
+                <w:sz w:val="22"/>
+              </w:rPr>
+              <w:t>可选窗口</w:t>
+            </w:r>
+          </w:p>
+        </w:tc>
+        <w:tc>
+          <w:tcPr>
+            <w:tcW w:type="dxa" w:w="3022"/>
+          </w:tcPr>
+          <w:p>
+            <w:r/>
+            <w:r>
+              <w:rPr>
+                <w:rFonts w:ascii="黑体" w:hAnsi="黑体" w:eastAsia="黑体"/>
+                <w:b/>
+                <w:sz w:val="22"/>
+              </w:rPr>
+              <w:t>理由</w:t>
+            </w:r>
+          </w:p>
+        </w:tc>
+        <w:tc>
+          <w:tcPr>
+            <w:tcW w:type="dxa" w:w="3022"/>
+          </w:tcPr>
+          <w:p>
+            <w:r/>
+            <w:r>
+              <w:rPr>
+                <w:rFonts w:ascii="黑体" w:hAnsi="黑体" w:eastAsia="黑体"/>
+                <w:b/>
+                <w:sz w:val="22"/>
+              </w:rPr>
+              <w:t>备注</w:t>
+            </w:r>
+          </w:p>
+        </w:tc>
+      </w:tr>
+      <w:tr>
+        <w:tc>
+          <w:tcPr>
+            <w:tcW w:type="dxa" w:w="3022"/>
+          </w:tcPr>
+          <w:p>
+            <w:r/>
+            <w:r>
+              <w:rPr>
+                <w:rFonts w:ascii="宋体" w:hAnsi="宋体" w:eastAsia="宋体"/>
+                <w:b w:val="0"/>
+                <w:sz w:val="21"/>
+              </w:rPr>
+              <w:t>中秋前后</w:t>
+            </w:r>
+          </w:p>
+        </w:tc>
+        <w:tc>
+          <w:tcPr>
+            <w:tcW w:type="dxa" w:w="3022"/>
+          </w:tcPr>
+          <w:p>
+            <w:r/>
+            <w:r>
+              <w:rPr>
+                <w:rFonts w:ascii="宋体" w:hAnsi="宋体" w:eastAsia="宋体"/>
+                <w:b w:val="0"/>
+                <w:sz w:val="21"/>
+              </w:rPr>
+              <w:t>团圆、念家、纸短情长</w:t>
+            </w:r>
+          </w:p>
+        </w:tc>
+        <w:tc>
+          <w:tcPr>
+            <w:tcW w:type="dxa" w:w="3022"/>
+          </w:tcPr>
+          <w:p>
+            <w:r/>
+            <w:r>
+              <w:rPr>
+                <w:rFonts w:ascii="宋体" w:hAnsi="宋体" w:eastAsia="宋体"/>
+                <w:b w:val="0"/>
+                <w:sz w:val="21"/>
+              </w:rPr>
+              <w:t>与「团圆可盼」气质近</w:t>
+            </w:r>
+          </w:p>
+        </w:tc>
+      </w:tr>
+      <w:tr>
+        <w:tc>
+          <w:tcPr>
+            <w:tcW w:type="dxa" w:w="3022"/>
+          </w:tcPr>
+          <w:p>
+            <w:r/>
+            <w:r>
+              <w:rPr>
+                <w:rFonts w:ascii="宋体" w:hAnsi="宋体" w:eastAsia="宋体"/>
+                <w:b w:val="0"/>
+                <w:sz w:val="21"/>
+              </w:rPr>
+              <w:t>重阳/秋末</w:t>
+            </w:r>
+          </w:p>
+        </w:tc>
+        <w:tc>
+          <w:tcPr>
+            <w:tcW w:type="dxa" w:w="3022"/>
+          </w:tcPr>
+          <w:p>
+            <w:r/>
+            <w:r>
+              <w:rPr>
+                <w:rFonts w:ascii="宋体" w:hAnsi="宋体" w:eastAsia="宋体"/>
+                <w:b w:val="0"/>
+                <w:sz w:val="21"/>
+              </w:rPr>
+              <w:t>敬老、惦记长辈</w:t>
+            </w:r>
+          </w:p>
+        </w:tc>
+        <w:tc>
+          <w:tcPr>
+            <w:tcW w:type="dxa" w:w="3022"/>
+          </w:tcPr>
+          <w:p>
+            <w:r/>
+            <w:r>
+              <w:rPr>
+                <w:rFonts w:ascii="宋体" w:hAnsi="宋体" w:eastAsia="宋体"/>
+                <w:b w:val="0"/>
+                <w:sz w:val="21"/>
+              </w:rPr>
+              <w:t>贴阿嬷线，竞品相对少抢情感档</w:t>
+            </w:r>
+          </w:p>
+        </w:tc>
+      </w:tr>
+      <w:tr>
+        <w:tc>
+          <w:tcPr>
+            <w:tcW w:type="dxa" w:w="3022"/>
+          </w:tcPr>
+          <w:p>
+            <w:r/>
+            <w:r>
+              <w:rPr>
+                <w:rFonts w:ascii="宋体" w:hAnsi="宋体" w:eastAsia="宋体"/>
+                <w:b w:val="0"/>
+                <w:sz w:val="21"/>
+              </w:rPr>
+              <w:t>春节前归乡季</w:t>
+            </w:r>
+          </w:p>
+        </w:tc>
+        <w:tc>
+          <w:tcPr>
+            <w:tcW w:type="dxa" w:w="3022"/>
+          </w:tcPr>
+          <w:p>
+            <w:r/>
+            <w:r>
+              <w:rPr>
+                <w:rFonts w:ascii="宋体" w:hAnsi="宋体" w:eastAsia="宋体"/>
+                <w:b w:val="0"/>
+                <w:sz w:val="21"/>
+              </w:rPr>
+              <w:t>报平安、回家</w:t>
+            </w:r>
+          </w:p>
+        </w:tc>
+        <w:tc>
+          <w:tcPr>
+            <w:tcW w:type="dxa" w:w="3022"/>
+          </w:tcPr>
+          <w:p>
+            <w:r/>
+            <w:r>
+              <w:rPr>
+                <w:rFonts w:ascii="宋体" w:hAnsi="宋体" w:eastAsia="宋体"/>
+                <w:b w:val="0"/>
+                <w:sz w:val="21"/>
+              </w:rPr>
+              <w:t>「切要平安」好用</w:t>
+            </w:r>
+          </w:p>
+        </w:tc>
+      </w:tr>
+      <w:tr>
+        <w:tc>
+          <w:tcPr>
+            <w:tcW w:type="dxa" w:w="3022"/>
+          </w:tcPr>
+          <w:p>
+            <w:r/>
+            <w:r>
+              <w:rPr>
+                <w:rFonts w:ascii="宋体" w:hAnsi="宋体" w:eastAsia="宋体"/>
+                <w:b w:val="0"/>
+                <w:sz w:val="21"/>
+              </w:rPr>
+              <w:t>翌年母亲节</w:t>
+            </w:r>
+          </w:p>
+        </w:tc>
+        <w:tc>
+          <w:tcPr>
+            <w:tcW w:type="dxa" w:w="3022"/>
+          </w:tcPr>
+          <w:p>
+            <w:r/>
+            <w:r>
+              <w:rPr>
+                <w:rFonts w:ascii="宋体" w:hAnsi="宋体" w:eastAsia="宋体"/>
+                <w:b w:val="0"/>
+                <w:sz w:val="21"/>
+              </w:rPr>
+              <w:t>母系长辈情绪</w:t>
+            </w:r>
+          </w:p>
+        </w:tc>
+        <w:tc>
+          <w:tcPr>
+            <w:tcW w:type="dxa" w:w="3022"/>
+          </w:tcPr>
+          <w:p>
+            <w:r/>
+            <w:r>
+              <w:rPr>
+                <w:rFonts w:ascii="宋体" w:hAnsi="宋体" w:eastAsia="宋体"/>
+                <w:b w:val="0"/>
+                <w:sz w:val="21"/>
+              </w:rPr>
+              <w:t>需避开纯促销感，偏「念你」</w:t>
+            </w:r>
+          </w:p>
+        </w:tc>
+      </w:tr>
+    </w:tbl>
+    <w:p/>
+    <w:p>
+      <w:pPr>
+        <w:spacing w:after="120" w:line="360" w:lineRule="auto"/>
+        <w:ind w:firstLine="420"/>
+      </w:pPr>
+      <w:r>
+        <w:rPr>
+          <w:rFonts w:ascii="宋体" w:hAnsi="宋体" w:eastAsia="宋体"/>
+          <w:b w:val="0"/>
+          <w:sz w:val="24"/>
+        </w:rPr>
+        <w:t>若片方有重映、衍生或文旅节点，可优先合流，不必单开重预算档期。</w:t>
       </w:r>
     </w:p>
     <w:p>
@@ -3249,157 +2347,7 @@
           <w:b/>
           <w:sz w:val="32"/>
         </w:rPr>
-        <w:t>九、为什么具备商业落地性</w:t>
-      </w:r>
-    </w:p>
-    <w:p>
-      <w:pPr>
-        <w:pStyle w:val="ListBullet"/>
-        <w:spacing w:line="360" w:lineRule="auto"/>
-      </w:pPr>
-      <w:r>
-        <w:rPr>
-          <w:rFonts w:ascii="宋体" w:hAnsi="宋体" w:eastAsia="宋体"/>
-          <w:b/>
-          <w:sz w:val="24"/>
-        </w:rPr>
-        <w:t xml:space="preserve">1. </w:t>
-      </w:r>
-      <w:r>
-        <w:rPr>
-          <w:rFonts w:ascii="宋体" w:hAnsi="宋体" w:eastAsia="宋体"/>
-          <w:b w:val="0"/>
-          <w:sz w:val="24"/>
-        </w:rPr>
-        <w:t>产品开发轻量：复用成熟茶底与小料，情绪在命名与包材。</w:t>
-      </w:r>
-    </w:p>
-    <w:p>
-      <w:pPr>
-        <w:pStyle w:val="ListBullet"/>
-        <w:spacing w:line="360" w:lineRule="auto"/>
-      </w:pPr>
-      <w:r>
-        <w:rPr>
-          <w:rFonts w:ascii="宋体" w:hAnsi="宋体" w:eastAsia="宋体"/>
-          <w:b/>
-          <w:sz w:val="24"/>
-        </w:rPr>
-        <w:t xml:space="preserve">2. </w:t>
-      </w:r>
-      <w:r>
-        <w:rPr>
-          <w:rFonts w:ascii="宋体" w:hAnsi="宋体" w:eastAsia="宋体"/>
-          <w:b w:val="0"/>
-          <w:sz w:val="24"/>
-        </w:rPr>
-        <w:t>门店执行轻量：杯套、小票、海报、信箱卡，非全国硬装。</w:t>
-      </w:r>
-    </w:p>
-    <w:p>
-      <w:pPr>
-        <w:pStyle w:val="ListBullet"/>
-        <w:spacing w:line="360" w:lineRule="auto"/>
-      </w:pPr>
-      <w:r>
-        <w:rPr>
-          <w:rFonts w:ascii="宋体" w:hAnsi="宋体" w:eastAsia="宋体"/>
-          <w:b/>
-          <w:sz w:val="24"/>
-        </w:rPr>
-        <w:t xml:space="preserve">3. </w:t>
-      </w:r>
-      <w:r>
-        <w:rPr>
-          <w:rFonts w:ascii="宋体" w:hAnsi="宋体" w:eastAsia="宋体"/>
-          <w:b w:val="0"/>
-          <w:sz w:val="24"/>
-        </w:rPr>
-        <w:t>机制有先例：票根、侨批卡、杯套互宣已在电影联名中出现并出圈（公开报道）。</w:t>
-      </w:r>
-    </w:p>
-    <w:p>
-      <w:pPr>
-        <w:pStyle w:val="ListBullet"/>
-        <w:spacing w:line="360" w:lineRule="auto"/>
-      </w:pPr>
-      <w:r>
-        <w:rPr>
-          <w:rFonts w:ascii="宋体" w:hAnsi="宋体" w:eastAsia="宋体"/>
-          <w:b/>
-          <w:sz w:val="24"/>
-        </w:rPr>
-        <w:t xml:space="preserve">4. </w:t>
-      </w:r>
-      <w:r>
-        <w:rPr>
-          <w:rFonts w:ascii="宋体" w:hAnsi="宋体" w:eastAsia="宋体"/>
-          <w:b w:val="0"/>
-          <w:sz w:val="24"/>
-        </w:rPr>
-        <w:t>对齐喜茶策略：情感型、少而精；补「与该电影官联」空白。</w:t>
-      </w:r>
-    </w:p>
-    <w:p>
-      <w:pPr>
-        <w:pStyle w:val="ListBullet"/>
-        <w:spacing w:line="360" w:lineRule="auto"/>
-      </w:pPr>
-      <w:r>
-        <w:rPr>
-          <w:rFonts w:ascii="宋体" w:hAnsi="宋体" w:eastAsia="宋体"/>
-          <w:b/>
-          <w:sz w:val="24"/>
-        </w:rPr>
-        <w:t xml:space="preserve">5. </w:t>
-      </w:r>
-      <w:r>
-        <w:rPr>
-          <w:rFonts w:ascii="宋体" w:hAnsi="宋体" w:eastAsia="宋体"/>
-          <w:b w:val="0"/>
-          <w:sz w:val="24"/>
-        </w:rPr>
-        <w:t>短长兼顾：短期套餐与到店；长期沉淀「念你」内容资产，可复用于重阳/母亲节等节点。</w:t>
-      </w:r>
-    </w:p>
-    <w:p>
-      <w:pPr>
-        <w:spacing w:before="280" w:after="160"/>
-      </w:pPr>
-      <w:r>
-        <w:rPr>
-          <w:rFonts w:ascii="黑体" w:hAnsi="黑体" w:eastAsia="黑体"/>
-          <w:b/>
-          <w:sz w:val="32"/>
-        </w:rPr>
-        <w:t>十、排期、预算原则与风险</w:t>
-      </w:r>
-    </w:p>
-    <w:p>
-      <w:pPr>
-        <w:spacing w:before="200" w:after="160"/>
-      </w:pPr>
-      <w:r>
-        <w:rPr>
-          <w:rFonts w:ascii="黑体" w:hAnsi="黑体" w:eastAsia="黑体"/>
-          <w:b/>
-          <w:sz w:val="28"/>
-        </w:rPr>
-        <w:t>10.1 排期逻辑（待确认档期）</w:t>
-      </w:r>
-    </w:p>
-    <w:p>
-      <w:pPr>
-        <w:spacing w:after="120" w:before="0" w:line="360" w:lineRule="auto"/>
-        <w:ind w:firstLine="420"/>
-      </w:pPr>
-      <w:r>
-        <w:rPr>
-          <w:rFonts w:ascii="宋体" w:hAnsi="宋体" w:eastAsia="宋体"/>
-          <w:b w:val="0"/>
-          <w:sz w:val="24"/>
-        </w:rPr>
-        <w:t>电影已于2026年4月30日上映并进入长尾。联名更适合「长尾情感复购」或绑定重映/衍生品/节日（中秋、重阳、春节归乡、翌年母亲节），而非假装仍在点映周。具体窗口需与片方宣发与喜茶档期共同确认。</w:t>
+        <w:t>七、周边</w:t>
       </w:r>
     </w:p>
     <w:tbl>
@@ -3425,7 +2373,7 @@
                 <w:b/>
                 <w:sz w:val="22"/>
               </w:rPr>
-              <w:t>周次</w:t>
+              <w:t>优先级</w:t>
             </w:r>
           </w:p>
         </w:tc>
@@ -3441,7 +2389,7 @@
                 <w:b/>
                 <w:sz w:val="22"/>
               </w:rPr>
-              <w:t>事项</w:t>
+              <w:t>物品</w:t>
             </w:r>
           </w:p>
         </w:tc>
@@ -3459,7 +2407,7 @@
                 <w:b w:val="0"/>
                 <w:sz w:val="21"/>
               </w:rPr>
-              <w:t>T-4～T-3</w:t>
+              <w:t>必做</w:t>
             </w:r>
           </w:p>
         </w:tc>
@@ -3475,7 +2423,7 @@
                 <w:b w:val="0"/>
                 <w:sz w:val="21"/>
               </w:rPr>
-              <w:t>授权谈判、金句与物料过审、配方封样、包材印刷</w:t>
+              <w:t>家书短笺/明信片；贴纸</w:t>
             </w:r>
           </w:p>
         </w:tc>
@@ -3493,7 +2441,7 @@
                 <w:b w:val="0"/>
                 <w:sz w:val="21"/>
               </w:rPr>
-              <w:t>T-2</w:t>
+              <w:t>可选</w:t>
             </w:r>
           </w:p>
         </w:tc>
@@ -3509,7 +2457,7 @@
                 <w:b w:val="0"/>
                 <w:sz w:val="21"/>
               </w:rPr>
-              <w:t>预热物料、KOL确认、重点店装置进场</w:t>
+              <w:t>搪瓷杯（念你）加价购</w:t>
             </w:r>
           </w:p>
         </w:tc>
@@ -3527,7 +2475,7 @@
                 <w:b w:val="0"/>
                 <w:sz w:val="21"/>
               </w:rPr>
-              <w:t>T-0～T+2</w:t>
+              <w:t>不做</w:t>
             </w:r>
           </w:p>
         </w:tc>
@@ -3543,41 +2491,7 @@
                 <w:b w:val="0"/>
                 <w:sz w:val="21"/>
               </w:rPr>
-              <w:t>上线爆发、票根核销、内容日更</w:t>
-            </w:r>
-          </w:p>
-        </w:tc>
-      </w:tr>
-      <w:tr>
-        <w:tc>
-          <w:tcPr>
-            <w:tcW w:type="dxa" w:w="4533"/>
-          </w:tcPr>
-          <w:p>
-            <w:r/>
-            <w:r>
-              <w:rPr>
-                <w:rFonts w:ascii="宋体" w:hAnsi="宋体" w:eastAsia="宋体"/>
-                <w:b w:val="0"/>
-                <w:sz w:val="21"/>
-              </w:rPr>
-              <w:t>T+3～T+6</w:t>
-            </w:r>
-          </w:p>
-        </w:tc>
-        <w:tc>
-          <w:tcPr>
-            <w:tcW w:type="dxa" w:w="4533"/>
-          </w:tcPr>
-          <w:p>
-            <w:r/>
-            <w:r>
-              <w:rPr>
-                <w:rFonts w:ascii="宋体" w:hAnsi="宋体" w:eastAsia="宋体"/>
-                <w:b w:val="0"/>
-                <w:sz w:val="21"/>
-              </w:rPr>
-              <w:t>长尾二创、库存消化、复盘报告</w:t>
+              <w:t>与电影弱相关的杂货挂件</w:t>
             </w:r>
           </w:p>
         </w:tc>
@@ -3586,15 +2500,15 @@
     <w:p/>
     <w:p>
       <w:pPr>
-        <w:spacing w:before="200" w:after="160"/>
+        <w:spacing w:before="280" w:after="160"/>
       </w:pPr>
       <w:r>
         <w:rPr>
           <w:rFonts w:ascii="黑体" w:hAnsi="黑体" w:eastAsia="黑体"/>
           <w:b/>
-          <w:sz w:val="28"/>
+          <w:sz w:val="32"/>
         </w:rPr>
-        <w:t>10.2 预算原则（不编造总额）</w:t>
+        <w:t>八、传播</w:t>
       </w:r>
     </w:p>
     <w:p>
@@ -3608,7 +2522,7 @@
           <w:b w:val="0"/>
           <w:sz w:val="24"/>
         </w:rPr>
-        <w:t>大头通常在：授权、包材加印、重点店装置、投放与KOL、周边生产。</w:t>
+        <w:t>主话题：#心中念你；辅：#念你安康 #先报平安</w:t>
       </w:r>
     </w:p>
     <w:p>
@@ -3622,7 +2536,7 @@
           <w:b w:val="0"/>
           <w:sz w:val="24"/>
         </w:rPr>
-        <w:t>可省：全国硬装、重剧情快闪、过多SKU。</w:t>
+        <w:t>内容抓手：捧杯、写短笺、票根与杯并置；少唯「好喝测评」</w:t>
       </w:r>
     </w:p>
     <w:p>
@@ -3636,20 +2550,535 @@
           <w:b w:val="0"/>
           <w:sz w:val="24"/>
         </w:rPr>
-        <w:t>提案阶段用「低/中/高三档」内部估算表，数字由喜茶商业侧填写。</w:t>
+        <w:t>KOL：情感、生活方式、电影、探店；试点城市本地博主优先</w:t>
       </w:r>
     </w:p>
     <w:p>
       <w:pPr>
-        <w:spacing w:before="200" w:after="160"/>
+        <w:pStyle w:val="ListBullet"/>
+        <w:spacing w:line="360" w:lineRule="auto"/>
+      </w:pPr>
+      <w:r>
+        <w:rPr>
+          <w:rFonts w:ascii="宋体" w:hAnsi="宋体" w:eastAsia="宋体"/>
+          <w:b w:val="0"/>
+          <w:sz w:val="24"/>
+        </w:rPr>
+        <w:t>长尾：精选用户句子做「许多句念你」长图</w:t>
+      </w:r>
+    </w:p>
+    <w:p>
+      <w:pPr>
+        <w:spacing w:before="280" w:after="160"/>
       </w:pPr>
       <w:r>
         <w:rPr>
           <w:rFonts w:ascii="黑体" w:hAnsi="黑体" w:eastAsia="黑体"/>
           <w:b/>
-          <w:sz w:val="28"/>
+          <w:sz w:val="32"/>
         </w:rPr>
-        <w:t>10.3 风险与备选</w:t>
+        <w:t>九、预算原则（分区、不写死总额）</w:t>
+      </w:r>
+    </w:p>
+    <w:p>
+      <w:pPr>
+        <w:spacing w:after="120" w:line="360" w:lineRule="auto"/>
+        <w:ind w:firstLine="420"/>
+      </w:pPr>
+      <w:r>
+        <w:rPr>
+          <w:rFonts w:ascii="宋体" w:hAnsi="宋体" w:eastAsia="宋体"/>
+          <w:b w:val="0"/>
+          <w:sz w:val="24"/>
+        </w:rPr>
+        <w:t>现阶段不做虚假精确报价。建议按试点分区匡算，由喜茶商业侧填数：</w:t>
+      </w:r>
+    </w:p>
+    <w:tbl>
+      <w:tblPr>
+        <w:tblStyle w:val="TableGrid"/>
+        <w:tblW w:type="auto" w:w="0"/>
+        <w:tblLook w:firstColumn="1" w:firstRow="1" w:lastColumn="0" w:lastRow="0" w:noHBand="0" w:noVBand="1" w:val="04A0"/>
+      </w:tblPr>
+      <w:tblGrid>
+        <w:gridCol w:w="3022"/>
+        <w:gridCol w:w="3022"/>
+        <w:gridCol w:w="3022"/>
+      </w:tblGrid>
+      <w:tr>
+        <w:tc>
+          <w:tcPr>
+            <w:tcW w:type="dxa" w:w="3022"/>
+          </w:tcPr>
+          <w:p>
+            <w:r/>
+            <w:r>
+              <w:rPr>
+                <w:rFonts w:ascii="黑体" w:hAnsi="黑体" w:eastAsia="黑体"/>
+                <w:b/>
+                <w:sz w:val="22"/>
+              </w:rPr>
+              <w:t>费用模块</w:t>
+            </w:r>
+          </w:p>
+        </w:tc>
+        <w:tc>
+          <w:tcPr>
+            <w:tcW w:type="dxa" w:w="3022"/>
+          </w:tcPr>
+          <w:p>
+            <w:r/>
+            <w:r>
+              <w:rPr>
+                <w:rFonts w:ascii="黑体" w:hAnsi="黑体" w:eastAsia="黑体"/>
+                <w:b/>
+                <w:sz w:val="22"/>
+              </w:rPr>
+              <w:t>试点期关注点</w:t>
+            </w:r>
+          </w:p>
+        </w:tc>
+        <w:tc>
+          <w:tcPr>
+            <w:tcW w:type="dxa" w:w="3022"/>
+          </w:tcPr>
+          <w:p>
+            <w:r/>
+            <w:r>
+              <w:rPr>
+                <w:rFonts w:ascii="黑体" w:hAnsi="黑体" w:eastAsia="黑体"/>
+                <w:b/>
+                <w:sz w:val="22"/>
+              </w:rPr>
+              <w:t>扩面时</w:t>
+            </w:r>
+          </w:p>
+        </w:tc>
+      </w:tr>
+      <w:tr>
+        <w:tc>
+          <w:tcPr>
+            <w:tcW w:type="dxa" w:w="3022"/>
+          </w:tcPr>
+          <w:p>
+            <w:r/>
+            <w:r>
+              <w:rPr>
+                <w:rFonts w:ascii="宋体" w:hAnsi="宋体" w:eastAsia="宋体"/>
+                <w:b w:val="0"/>
+                <w:sz w:val="21"/>
+              </w:rPr>
+              <w:t>IP授权与物料过审</w:t>
+            </w:r>
+          </w:p>
+        </w:tc>
+        <w:tc>
+          <w:tcPr>
+            <w:tcW w:type="dxa" w:w="3022"/>
+          </w:tcPr>
+          <w:p>
+            <w:r/>
+            <w:r>
+              <w:rPr>
+                <w:rFonts w:ascii="宋体" w:hAnsi="宋体" w:eastAsia="宋体"/>
+                <w:b w:val="0"/>
+                <w:sz w:val="21"/>
+              </w:rPr>
+              <w:t>金句/形象授权范围</w:t>
+            </w:r>
+          </w:p>
+        </w:tc>
+        <w:tc>
+          <w:tcPr>
+            <w:tcW w:type="dxa" w:w="3022"/>
+          </w:tcPr>
+          <w:p>
+            <w:r/>
+            <w:r>
+              <w:rPr>
+                <w:rFonts w:ascii="宋体" w:hAnsi="宋体" w:eastAsia="宋体"/>
+                <w:b w:val="0"/>
+                <w:sz w:val="21"/>
+              </w:rPr>
+              <w:t>全国授权加价条款</w:t>
+            </w:r>
+          </w:p>
+        </w:tc>
+      </w:tr>
+      <w:tr>
+        <w:tc>
+          <w:tcPr>
+            <w:tcW w:type="dxa" w:w="3022"/>
+          </w:tcPr>
+          <w:p>
+            <w:r/>
+            <w:r>
+              <w:rPr>
+                <w:rFonts w:ascii="宋体" w:hAnsi="宋体" w:eastAsia="宋体"/>
+                <w:b w:val="0"/>
+                <w:sz w:val="21"/>
+              </w:rPr>
+              <w:t>包材加印</w:t>
+            </w:r>
+          </w:p>
+        </w:tc>
+        <w:tc>
+          <w:tcPr>
+            <w:tcW w:type="dxa" w:w="3022"/>
+          </w:tcPr>
+          <w:p>
+            <w:r/>
+            <w:r>
+              <w:rPr>
+                <w:rFonts w:ascii="宋体" w:hAnsi="宋体" w:eastAsia="宋体"/>
+                <w:b w:val="0"/>
+                <w:sz w:val="21"/>
+              </w:rPr>
+              <w:t>试点城市用量</w:t>
+            </w:r>
+          </w:p>
+        </w:tc>
+        <w:tc>
+          <w:tcPr>
+            <w:tcW w:type="dxa" w:w="3022"/>
+          </w:tcPr>
+          <w:p>
+            <w:r/>
+            <w:r>
+              <w:rPr>
+                <w:rFonts w:ascii="宋体" w:hAnsi="宋体" w:eastAsia="宋体"/>
+                <w:b w:val="0"/>
+                <w:sz w:val="21"/>
+              </w:rPr>
+              <w:t>全国加印</w:t>
+            </w:r>
+          </w:p>
+        </w:tc>
+      </w:tr>
+      <w:tr>
+        <w:tc>
+          <w:tcPr>
+            <w:tcW w:type="dxa" w:w="3022"/>
+          </w:tcPr>
+          <w:p>
+            <w:r/>
+            <w:r>
+              <w:rPr>
+                <w:rFonts w:ascii="宋体" w:hAnsi="宋体" w:eastAsia="宋体"/>
+                <w:b w:val="0"/>
+                <w:sz w:val="21"/>
+              </w:rPr>
+              <w:t>门店轻装置</w:t>
+            </w:r>
+          </w:p>
+        </w:tc>
+        <w:tc>
+          <w:tcPr>
+            <w:tcW w:type="dxa" w:w="3022"/>
+          </w:tcPr>
+          <w:p>
+            <w:r/>
+            <w:r>
+              <w:rPr>
+                <w:rFonts w:ascii="宋体" w:hAnsi="宋体" w:eastAsia="宋体"/>
+                <w:b w:val="0"/>
+                <w:sz w:val="21"/>
+              </w:rPr>
+              <w:t>每店信箱/海报套件</w:t>
+            </w:r>
+          </w:p>
+        </w:tc>
+        <w:tc>
+          <w:tcPr>
+            <w:tcW w:type="dxa" w:w="3022"/>
+          </w:tcPr>
+          <w:p>
+            <w:r/>
+            <w:r>
+              <w:rPr>
+                <w:rFonts w:ascii="宋体" w:hAnsi="宋体" w:eastAsia="宋体"/>
+                <w:b w:val="0"/>
+                <w:sz w:val="21"/>
+              </w:rPr>
+              <w:t>复制单价×店数</w:t>
+            </w:r>
+          </w:p>
+        </w:tc>
+      </w:tr>
+      <w:tr>
+        <w:tc>
+          <w:tcPr>
+            <w:tcW w:type="dxa" w:w="3022"/>
+          </w:tcPr>
+          <w:p>
+            <w:r/>
+            <w:r>
+              <w:rPr>
+                <w:rFonts w:ascii="宋体" w:hAnsi="宋体" w:eastAsia="宋体"/>
+                <w:b w:val="0"/>
+                <w:sz w:val="21"/>
+              </w:rPr>
+              <w:t>快闪（可选）</w:t>
+            </w:r>
+          </w:p>
+        </w:tc>
+        <w:tc>
+          <w:tcPr>
+            <w:tcW w:type="dxa" w:w="3022"/>
+          </w:tcPr>
+          <w:p>
+            <w:r/>
+            <w:r>
+              <w:rPr>
+                <w:rFonts w:ascii="宋体" w:hAnsi="宋体" w:eastAsia="宋体"/>
+                <w:b w:val="0"/>
+                <w:sz w:val="21"/>
+              </w:rPr>
+              <w:t>单城单点封顶</w:t>
+            </w:r>
+          </w:p>
+        </w:tc>
+        <w:tc>
+          <w:tcPr>
+            <w:tcW w:type="dxa" w:w="3022"/>
+          </w:tcPr>
+          <w:p>
+            <w:r/>
+            <w:r>
+              <w:rPr>
+                <w:rFonts w:ascii="宋体" w:hAnsi="宋体" w:eastAsia="宋体"/>
+                <w:b w:val="0"/>
+                <w:sz w:val="21"/>
+              </w:rPr>
+              <w:t>可不扩</w:t>
+            </w:r>
+          </w:p>
+        </w:tc>
+      </w:tr>
+      <w:tr>
+        <w:tc>
+          <w:tcPr>
+            <w:tcW w:type="dxa" w:w="3022"/>
+          </w:tcPr>
+          <w:p>
+            <w:r/>
+            <w:r>
+              <w:rPr>
+                <w:rFonts w:ascii="宋体" w:hAnsi="宋体" w:eastAsia="宋体"/>
+                <w:b w:val="0"/>
+                <w:sz w:val="21"/>
+              </w:rPr>
+              <w:t>投放与KOL</w:t>
+            </w:r>
+          </w:p>
+        </w:tc>
+        <w:tc>
+          <w:tcPr>
+            <w:tcW w:type="dxa" w:w="3022"/>
+          </w:tcPr>
+          <w:p>
+            <w:r/>
+            <w:r>
+              <w:rPr>
+                <w:rFonts w:ascii="宋体" w:hAnsi="宋体" w:eastAsia="宋体"/>
+                <w:b w:val="0"/>
+                <w:sz w:val="21"/>
+              </w:rPr>
+              <w:t>试点城市+线上</w:t>
+            </w:r>
+          </w:p>
+        </w:tc>
+        <w:tc>
+          <w:tcPr>
+            <w:tcW w:type="dxa" w:w="3022"/>
+          </w:tcPr>
+          <w:p>
+            <w:r/>
+            <w:r>
+              <w:rPr>
+                <w:rFonts w:ascii="宋体" w:hAnsi="宋体" w:eastAsia="宋体"/>
+                <w:b w:val="0"/>
+                <w:sz w:val="21"/>
+              </w:rPr>
+              <w:t>按ROI加预算</w:t>
+            </w:r>
+          </w:p>
+        </w:tc>
+      </w:tr>
+      <w:tr>
+        <w:tc>
+          <w:tcPr>
+            <w:tcW w:type="dxa" w:w="3022"/>
+          </w:tcPr>
+          <w:p>
+            <w:r/>
+            <w:r>
+              <w:rPr>
+                <w:rFonts w:ascii="宋体" w:hAnsi="宋体" w:eastAsia="宋体"/>
+                <w:b w:val="0"/>
+                <w:sz w:val="21"/>
+              </w:rPr>
+              <w:t>周边生产</w:t>
+            </w:r>
+          </w:p>
+        </w:tc>
+        <w:tc>
+          <w:tcPr>
+            <w:tcW w:type="dxa" w:w="3022"/>
+          </w:tcPr>
+          <w:p>
+            <w:r/>
+            <w:r>
+              <w:rPr>
+                <w:rFonts w:ascii="宋体" w:hAnsi="宋体" w:eastAsia="宋体"/>
+                <w:b w:val="0"/>
+                <w:sz w:val="21"/>
+              </w:rPr>
+              <w:t>短笺贴纸小批量</w:t>
+            </w:r>
+          </w:p>
+        </w:tc>
+        <w:tc>
+          <w:tcPr>
+            <w:tcW w:type="dxa" w:w="3022"/>
+          </w:tcPr>
+          <w:p>
+            <w:r/>
+            <w:r>
+              <w:rPr>
+                <w:rFonts w:ascii="宋体" w:hAnsi="宋体" w:eastAsia="宋体"/>
+                <w:b w:val="0"/>
+                <w:sz w:val="21"/>
+              </w:rPr>
+              <w:t>加价购杯按预售</w:t>
+            </w:r>
+          </w:p>
+        </w:tc>
+      </w:tr>
+    </w:tbl>
+    <w:p/>
+    <w:p>
+      <w:pPr>
+        <w:pStyle w:val="ListBullet"/>
+        <w:spacing w:line="360" w:lineRule="auto"/>
+      </w:pPr>
+      <w:r>
+        <w:rPr>
+          <w:rFonts w:ascii="宋体" w:hAnsi="宋体" w:eastAsia="宋体"/>
+          <w:b w:val="0"/>
+          <w:sz w:val="24"/>
+        </w:rPr>
+        <w:t>可省：全国硬装、多城重快闪、过多SKU。</w:t>
+      </w:r>
+    </w:p>
+    <w:p>
+      <w:pPr>
+        <w:pStyle w:val="ListBullet"/>
+        <w:spacing w:line="360" w:lineRule="auto"/>
+      </w:pPr>
+      <w:r>
+        <w:rPr>
+          <w:rFonts w:ascii="宋体" w:hAnsi="宋体" w:eastAsia="宋体"/>
+          <w:b w:val="0"/>
+          <w:sz w:val="24"/>
+        </w:rPr>
+        <w:t>内部可用低/中/高三档表，数字由品牌填写后再进合同。</w:t>
+      </w:r>
+    </w:p>
+    <w:p>
+      <w:pPr>
+        <w:spacing w:before="280" w:after="160"/>
+      </w:pPr>
+      <w:r>
+        <w:rPr>
+          <w:rFonts w:ascii="黑体" w:hAnsi="黑体" w:eastAsia="黑体"/>
+          <w:b/>
+          <w:sz w:val="32"/>
+        </w:rPr>
+        <w:t>十、为何可落地</w:t>
+      </w:r>
+    </w:p>
+    <w:p>
+      <w:pPr>
+        <w:pStyle w:val="ListBullet"/>
+        <w:spacing w:line="360" w:lineRule="auto"/>
+      </w:pPr>
+      <w:r>
+        <w:rPr>
+          <w:rFonts w:ascii="宋体" w:hAnsi="宋体" w:eastAsia="宋体"/>
+          <w:b w:val="0"/>
+          <w:sz w:val="24"/>
+        </w:rPr>
+        <w:t>产品轻：复用茶底小料。</w:t>
+      </w:r>
+    </w:p>
+    <w:p>
+      <w:pPr>
+        <w:pStyle w:val="ListBullet"/>
+        <w:spacing w:line="360" w:lineRule="auto"/>
+      </w:pPr>
+      <w:r>
+        <w:rPr>
+          <w:rFonts w:ascii="宋体" w:hAnsi="宋体" w:eastAsia="宋体"/>
+          <w:b w:val="0"/>
+          <w:sz w:val="24"/>
+        </w:rPr>
+        <w:t>门店轻：杯套小票信箱，非硬装。</w:t>
+      </w:r>
+    </w:p>
+    <w:p>
+      <w:pPr>
+        <w:pStyle w:val="ListBullet"/>
+        <w:spacing w:line="360" w:lineRule="auto"/>
+      </w:pPr>
+      <w:r>
+        <w:rPr>
+          <w:rFonts w:ascii="宋体" w:hAnsi="宋体" w:eastAsia="宋体"/>
+          <w:b w:val="0"/>
+          <w:sz w:val="24"/>
+        </w:rPr>
+        <w:t>机制有公开先例：票根、侨批卡、杯套。</w:t>
+      </w:r>
+    </w:p>
+    <w:p>
+      <w:pPr>
+        <w:pStyle w:val="ListBullet"/>
+        <w:spacing w:line="360" w:lineRule="auto"/>
+      </w:pPr>
+      <w:r>
+        <w:rPr>
+          <w:rFonts w:ascii="宋体" w:hAnsi="宋体" w:eastAsia="宋体"/>
+          <w:b w:val="0"/>
+          <w:sz w:val="24"/>
+        </w:rPr>
+        <w:t>对齐喜茶少而精情感联名；补与该片官联空白。</w:t>
+      </w:r>
+    </w:p>
+    <w:p>
+      <w:pPr>
+        <w:pStyle w:val="ListBullet"/>
+        <w:spacing w:line="360" w:lineRule="auto"/>
+      </w:pPr>
+      <w:r>
+        <w:rPr>
+          <w:rFonts w:ascii="宋体" w:hAnsi="宋体" w:eastAsia="宋体"/>
+          <w:b w:val="0"/>
+          <w:sz w:val="24"/>
+        </w:rPr>
+        <w:t>试点控险：先华南+一媒体城，数据说话再扩。</w:t>
+      </w:r>
+    </w:p>
+    <w:p>
+      <w:pPr>
+        <w:spacing w:before="280" w:after="160"/>
+      </w:pPr>
+      <w:r>
+        <w:rPr>
+          <w:rFonts w:ascii="黑体" w:hAnsi="黑体" w:eastAsia="黑体"/>
+          <w:b/>
+          <w:sz w:val="32"/>
+        </w:rPr>
+        <w:t>十一、风险</w:t>
       </w:r>
     </w:p>
     <w:tbl>
@@ -3725,7 +3154,7 @@
                 <w:b w:val="0"/>
                 <w:sz w:val="21"/>
               </w:rPr>
-              <w:t>主视觉改用「念你。」「先报平安。」联名关系仍清晰</w:t>
+              <w:t>主视觉改「念你。」「先报平安。」</w:t>
             </w:r>
           </w:p>
         </w:tc>
@@ -3743,7 +3172,7 @@
                 <w:b w:val="0"/>
                 <w:sz w:val="21"/>
               </w:rPr>
-              <w:t>口味争议</w:t>
+              <w:t>与阿嬷手作心智重叠</w:t>
             </w:r>
           </w:p>
         </w:tc>
@@ -3759,7 +3188,7 @@
                 <w:b w:val="0"/>
                 <w:sz w:val="21"/>
               </w:rPr>
-              <w:t>主推熟悉牛乳茶；风物彩蛋款小范围测试</w:t>
+              <w:t>强调全国标准化「念你」牛乳茶，不做风物主推</w:t>
             </w:r>
           </w:p>
         </w:tc>
@@ -3777,7 +3206,7 @@
                 <w:b w:val="0"/>
                 <w:sz w:val="21"/>
               </w:rPr>
-              <w:t>舆情（代际/地域刻板）</w:t>
+              <w:t>档期模糊</w:t>
             </w:r>
           </w:p>
         </w:tc>
@@ -3793,7 +3222,7 @@
                 <w:b w:val="0"/>
                 <w:sz w:val="21"/>
               </w:rPr>
-              <w:t>文案避免消费苦难；强调惦记与平安，不卖惨</w:t>
+              <w:t>用长尾定位+可选节日窗口，不绑死单一大日</w:t>
             </w:r>
           </w:p>
         </w:tc>
@@ -3811,7 +3240,7 @@
                 <w:b w:val="0"/>
                 <w:sz w:val="21"/>
               </w:rPr>
-              <w:t>档期错位</w:t>
+              <w:t>试点外消费者失望</w:t>
             </w:r>
           </w:p>
         </w:tc>
@@ -3827,41 +3256,7 @@
                 <w:b w:val="0"/>
                 <w:sz w:val="21"/>
               </w:rPr>
-              <w:t>明确长尾定位；与文旅/重映节点合流</w:t>
-            </w:r>
-          </w:p>
-        </w:tc>
-      </w:tr>
-      <w:tr>
-        <w:tc>
-          <w:tcPr>
-            <w:tcW w:type="dxa" w:w="4533"/>
-          </w:tcPr>
-          <w:p>
-            <w:r/>
-            <w:r>
-              <w:rPr>
-                <w:rFonts w:ascii="宋体" w:hAnsi="宋体" w:eastAsia="宋体"/>
-                <w:b w:val="0"/>
-                <w:sz w:val="21"/>
-              </w:rPr>
-              <w:t>与阿嬷手作心智撞车</w:t>
-            </w:r>
-          </w:p>
-        </w:tc>
-        <w:tc>
-          <w:tcPr>
-            <w:tcW w:type="dxa" w:w="4533"/>
-          </w:tcPr>
-          <w:p>
-            <w:r/>
-            <w:r>
-              <w:rPr>
-                <w:rFonts w:ascii="宋体" w:hAnsi="宋体" w:eastAsia="宋体"/>
-                <w:b w:val="0"/>
-                <w:sz w:val="21"/>
-              </w:rPr>
-              <w:t>差异化：全国标准化「念你」牛乳茶路径，不做区域风物主推</w:t>
+              <w:t>物料写清「先行城市」，并预告扩面条件</w:t>
             </w:r>
           </w:p>
         </w:tc>
@@ -3878,21 +3273,7 @@
           <w:b/>
           <w:sz w:val="32"/>
         </w:rPr>
-        <w:t>十一、附录：电影理解（供文案与过审对齐）</w:t>
-      </w:r>
-    </w:p>
-    <w:p>
-      <w:pPr>
-        <w:spacing w:after="120" w:before="0" w:line="360" w:lineRule="auto"/>
-        <w:ind w:firstLine="420"/>
-      </w:pPr>
-      <w:r>
-        <w:rPr>
-          <w:rFonts w:ascii="宋体" w:hAnsi="宋体" w:eastAsia="宋体"/>
-          <w:b w:val="0"/>
-          <w:sz w:val="24"/>
-        </w:rPr>
-        <w:t>本附录帮助执行团队避免把电影扁平成「对奶奶说爱」。</w:t>
+        <w:t>十二、电影理解附录</w:t>
       </w:r>
     </w:p>
     <w:p>
@@ -3906,7 +3287,7 @@
           <w:b w:val="0"/>
           <w:sz w:val="24"/>
         </w:rPr>
-        <w:t>主线情感：隔代与夫妻的守望；更意外的一层是南枝的情义——不是血缘，是十八年的代寄。</w:t>
+        <w:t>主线：守望与寻亲；升维：南枝代寄的情义。</w:t>
       </w:r>
     </w:p>
     <w:p>
@@ -3920,7 +3301,7 @@
           <w:b w:val="0"/>
           <w:sz w:val="24"/>
         </w:rPr>
-        <w:t>核心器物：侨批（银信）——通信与汇款的合体，是叙事引擎也是情感伦理。</w:t>
+        <w:t>器物：侨批；语气：报平安、念安康、纸短情长。</w:t>
       </w:r>
     </w:p>
     <w:p>
@@ -3934,7 +3315,47 @@
           <w:b w:val="0"/>
           <w:sz w:val="24"/>
         </w:rPr>
-        <w:t>语言气质：潮汕方言、克制、烟火；金句古雅如「江海万里，心中念你，便不觉远」。</w:t>
+        <w:t>忌：消费苦难、猎奇下南洋、杂货怀旧冒充潮汕。</w:t>
+      </w:r>
+    </w:p>
+    <w:p>
+      <w:pPr>
+        <w:spacing w:before="280" w:after="160"/>
+      </w:pPr>
+      <w:r>
+        <w:rPr>
+          <w:rFonts w:ascii="黑体" w:hAnsi="黑体" w:eastAsia="黑体"/>
+          <w:b/>
+          <w:sz w:val="32"/>
+        </w:rPr>
+        <w:t>十三、面试口述（约60秒）</w:t>
+      </w:r>
+    </w:p>
+    <w:p>
+      <w:pPr>
+        <w:spacing w:after="120" w:line="360" w:lineRule="auto"/>
+        <w:ind w:firstLine="420"/>
+      </w:pPr>
+      <w:r>
+        <w:rPr>
+          <w:rFonts w:ascii="宋体" w:hAnsi="宋体" w:eastAsia="宋体"/>
+          <w:b w:val="0"/>
+          <w:sz w:val="24"/>
+        </w:rPr>
+        <w:t>我按喜茶联名执行、电影做IP授权来写。电影讲侨批里的念你与报平安；阿嬷手作、一杯潮茶已证明杯套、侨批卡、票根能出圈，但喜茶还没有和这部电影官联。主题《心中念你》，主句用观众记住的「心中念你，便不觉远」，产品叫「念你」，口味走熟悉红茶牛乳。先在华南加一个媒体城市试点，票根核销、信箱短笺都先小范围跑，数据好再扩。金句池里还有心有所寄、纸短情长、切要平安等，授权后轮换印在杯套内侧。这不是教人告白，只是请人喝杯茶，轻轻念一念。</w:t>
+      </w:r>
+    </w:p>
+    <w:p>
+      <w:pPr>
+        <w:spacing w:before="280" w:after="160"/>
+      </w:pPr>
+      <w:r>
+        <w:rPr>
+          <w:rFonts w:ascii="黑体" w:hAnsi="黑体" w:eastAsia="黑体"/>
+          <w:b/>
+          <w:sz w:val="32"/>
+        </w:rPr>
+        <w:t>主要公开来源</w:t>
       </w:r>
     </w:p>
     <w:p>
@@ -3948,7 +3369,7 @@
           <w:b w:val="0"/>
           <w:sz w:val="24"/>
         </w:rPr>
-        <w:t>商业转化友好点：走出影院后的余韵需要「轻出口」——茶、短笺、票根，已被先例验证。</w:t>
+        <w:t>电影与侨批：维基、新华网等；票房：36氪援引猫眼等。</w:t>
       </w:r>
     </w:p>
     <w:p>
@@ -3962,89 +3383,7 @@
           <w:b w:val="0"/>
           <w:sz w:val="24"/>
         </w:rPr>
-        <w:t>忌讳：戏说历史苦难、消费「下南洋」猎奇、用杂货怀旧冒充潮汕文化。</w:t>
-      </w:r>
-    </w:p>
-    <w:p>
-      <w:pPr>
-        <w:spacing w:before="280" w:after="160"/>
-      </w:pPr>
-      <w:r>
-        <w:rPr>
-          <w:rFonts w:ascii="黑体" w:hAnsi="黑体" w:eastAsia="黑体"/>
-          <w:b/>
-          <w:sz w:val="32"/>
-        </w:rPr>
-        <w:t>十二、面试口述稿（约60秒）</w:t>
-      </w:r>
-    </w:p>
-    <w:p>
-      <w:pPr>
-        <w:spacing w:after="120" w:before="0" w:line="360" w:lineRule="auto"/>
-        <w:ind w:firstLine="420"/>
-      </w:pPr>
-      <w:r>
-        <w:rPr>
-          <w:rFonts w:ascii="宋体" w:hAnsi="宋体" w:eastAsia="宋体"/>
-          <w:b w:val="0"/>
-          <w:sz w:val="24"/>
-        </w:rPr>
-        <w:t>我理解题目不是做一杯好看的联名奶茶，而是把《给阿嬷的情书》里「念你、报平安、纸短情长」的语气，接到喜茶能全国落地的产品与门店上。</w:t>
-      </w:r>
-    </w:p>
-    <w:p>
-      <w:pPr>
-        <w:spacing w:after="120" w:before="0" w:line="360" w:lineRule="auto"/>
-        <w:ind w:firstLine="420"/>
-      </w:pPr>
-      <w:r>
-        <w:rPr>
-          <w:rFonts w:ascii="宋体" w:hAnsi="宋体" w:eastAsia="宋体"/>
-          <w:b w:val="0"/>
-          <w:sz w:val="24"/>
-        </w:rPr>
-        <w:t>公开信息里，阿嬷手作、一杯潮茶已经用杯套、侨批卡、票根证明了轻量联名能出圈；喜茶2025年联名也更偏少而精、治愈向，但和这部电影还没有官联——这是机会。</w:t>
-      </w:r>
-    </w:p>
-    <w:p>
-      <w:pPr>
-        <w:spacing w:after="120" w:before="0" w:line="360" w:lineRule="auto"/>
-        <w:ind w:firstLine="420"/>
-      </w:pPr>
-      <w:r>
-        <w:rPr>
-          <w:rFonts w:ascii="宋体" w:hAnsi="宋体" w:eastAsia="宋体"/>
-          <w:b w:val="0"/>
-          <w:sz w:val="24"/>
-        </w:rPr>
-        <w:t>我的主题是《心中念你》。主句用电影里观众记住的那句：「心中念你，便不觉远。」产品叫「念你」，口味走熟悉的红茶牛乳，不硬造供应链。真正发力的是杯套、小票、信箱短笺，还有票根从影院接到门店。参与时可以写给阿嬷，也可以写给心里惦记的人——主题不散，门口却不窄。</w:t>
-      </w:r>
-    </w:p>
-    <w:p>
-      <w:pPr>
-        <w:spacing w:after="120" w:before="0" w:line="360" w:lineRule="auto"/>
-        <w:ind w:firstLine="420"/>
-      </w:pPr>
-      <w:r>
-        <w:rPr>
-          <w:rFonts w:ascii="宋体" w:hAnsi="宋体" w:eastAsia="宋体"/>
-          <w:b w:val="0"/>
-          <w:sz w:val="24"/>
-        </w:rPr>
-        <w:t>这不是教人完成表达，只是请人喝杯茶，轻轻念一念。</w:t>
-      </w:r>
-    </w:p>
-    <w:p>
-      <w:pPr>
-        <w:spacing w:before="280" w:after="160"/>
-      </w:pPr>
-      <w:r>
-        <w:rPr>
-          <w:rFonts w:ascii="黑体" w:hAnsi="黑体" w:eastAsia="黑体"/>
-          <w:b/>
-          <w:sz w:val="32"/>
-        </w:rPr>
-        <w:t>十三、待你确认的问题（不确定处，请回复后可改第二版）</w:t>
+        <w:t>联名先例：界面、36氪、SocialBeta等。</w:t>
       </w:r>
     </w:p>
     <w:p>
@@ -4058,165 +3397,11 @@
           <w:b w:val="0"/>
           <w:sz w:val="24"/>
         </w:rPr>
-        <w:t>提案立场：以喜茶视角、电影IP视角，还是三联商业/内容中介视角撰写？影响「我们卖什么合作包」。</w:t>
+        <w:t>喜茶策略：深圳新闻网、广告门等关于2025降频提质、Chiikawa与星星人。</w:t>
       </w:r>
     </w:p>
     <w:p>
       <w:pPr>
-        <w:pStyle w:val="ListBullet"/>
-        <w:spacing w:line="360" w:lineRule="auto"/>
-      </w:pPr>
-      <w:r>
-        <w:rPr>
-          <w:rFonts w:ascii="宋体" w:hAnsi="宋体" w:eastAsia="宋体"/>
-          <w:b w:val="0"/>
-          <w:sz w:val="24"/>
-        </w:rPr>
-        <w:t>上线窗口：按长尾情感（例如中秋/重阳/春节），还是绑定某一宣发节点？</w:t>
-      </w:r>
-    </w:p>
-    <w:p>
-      <w:pPr>
-        <w:pStyle w:val="ListBullet"/>
-        <w:spacing w:line="360" w:lineRule="auto"/>
-      </w:pPr>
-      <w:r>
-        <w:rPr>
-          <w:rFonts w:ascii="宋体" w:hAnsi="宋体" w:eastAsia="宋体"/>
-          <w:b w:val="0"/>
-          <w:sz w:val="24"/>
-        </w:rPr>
-        <w:t>主宣传语是否争取授权原句「心中念你，便不觉远」？还是只用化用「念你」？</w:t>
-      </w:r>
-    </w:p>
-    <w:p>
-      <w:pPr>
-        <w:pStyle w:val="ListBullet"/>
-        <w:spacing w:line="360" w:lineRule="auto"/>
-      </w:pPr>
-      <w:r>
-        <w:rPr>
-          <w:rFonts w:ascii="宋体" w:hAnsi="宋体" w:eastAsia="宋体"/>
-          <w:b w:val="0"/>
-          <w:sz w:val="24"/>
-        </w:rPr>
-        <w:t>对外项目名用「阿嬷」（与片名一致）还是你习惯的「阿嫲」？</w:t>
-      </w:r>
-    </w:p>
-    <w:p>
-      <w:pPr>
-        <w:pStyle w:val="ListBullet"/>
-        <w:spacing w:line="360" w:lineRule="auto"/>
-      </w:pPr>
-      <w:r>
-        <w:rPr>
-          <w:rFonts w:ascii="宋体" w:hAnsi="宋体" w:eastAsia="宋体"/>
-          <w:b w:val="0"/>
-          <w:sz w:val="24"/>
-        </w:rPr>
-        <w:t>是否需要写进预算数字区间？若需要，你期望的量级大致是区域试点还是全国？</w:t>
-      </w:r>
-    </w:p>
-    <w:p>
-      <w:pPr>
-        <w:pStyle w:val="ListBullet"/>
-        <w:spacing w:line="360" w:lineRule="auto"/>
-      </w:pPr>
-      <w:r>
-        <w:rPr>
-          <w:rFonts w:ascii="宋体" w:hAnsi="宋体" w:eastAsia="宋体"/>
-          <w:b w:val="0"/>
-          <w:sz w:val="24"/>
-        </w:rPr>
-        <w:t>观影票根：是否默认全国核销，还是先一线/华南试点？</w:t>
-      </w:r>
-    </w:p>
-    <w:p>
-      <w:pPr>
-        <w:pStyle w:val="ListBullet"/>
-        <w:spacing w:line="360" w:lineRule="auto"/>
-      </w:pPr>
-      <w:r>
-        <w:rPr>
-          <w:rFonts w:ascii="宋体" w:hAnsi="宋体" w:eastAsia="宋体"/>
-          <w:b w:val="0"/>
-          <w:sz w:val="24"/>
-        </w:rPr>
-        <w:t>是否要单独一页「三联可提供的内容清单」（专题/沙龙/短视频）？</w:t>
-      </w:r>
-    </w:p>
-    <w:p>
-      <w:pPr>
-        <w:spacing w:before="200" w:after="160"/>
-      </w:pPr>
-      <w:r>
-        <w:rPr>
-          <w:rFonts w:ascii="黑体" w:hAnsi="黑体" w:eastAsia="黑体"/>
-          <w:b/>
-          <w:sz w:val="28"/>
-        </w:rPr>
-        <w:t>主要公开来源（撰写时参考，答辩可备查）</w:t>
-      </w:r>
-    </w:p>
-    <w:p>
-      <w:pPr>
-        <w:pStyle w:val="ListBullet"/>
-        <w:spacing w:line="360" w:lineRule="auto"/>
-      </w:pPr>
-      <w:r>
-        <w:rPr>
-          <w:rFonts w:ascii="宋体" w:hAnsi="宋体" w:eastAsia="宋体"/>
-          <w:b w:val="0"/>
-          <w:sz w:val="24"/>
-        </w:rPr>
-        <w:t>电影信息：维基百科词条《给阿嬷的情书》；豆瓣条目；新华网等关于侨批与金句的报道。</w:t>
-      </w:r>
-    </w:p>
-    <w:p>
-      <w:pPr>
-        <w:pStyle w:val="ListBullet"/>
-        <w:spacing w:line="360" w:lineRule="auto"/>
-      </w:pPr>
-      <w:r>
-        <w:rPr>
-          <w:rFonts w:ascii="宋体" w:hAnsi="宋体" w:eastAsia="宋体"/>
-          <w:b w:val="0"/>
-          <w:sz w:val="24"/>
-        </w:rPr>
-        <w:t>票房：36氪等援引猫眼专业版「破19亿」快讯；维基汇总口径；请以提案日实时数据更新。</w:t>
-      </w:r>
-    </w:p>
-    <w:p>
-      <w:pPr>
-        <w:pStyle w:val="ListBullet"/>
-        <w:spacing w:line="360" w:lineRule="auto"/>
-      </w:pPr>
-      <w:r>
-        <w:rPr>
-          <w:rFonts w:ascii="宋体" w:hAnsi="宋体" w:eastAsia="宋体"/>
-          <w:b w:val="0"/>
-          <w:sz w:val="24"/>
-        </w:rPr>
-        <w:t>电影联名：界面新闻、36氪关于一杯潮茶/阿嬷手作；SocialBeta等关于柑榄与单丛、票根机制。</w:t>
-      </w:r>
-    </w:p>
-    <w:p>
-      <w:pPr>
-        <w:pStyle w:val="ListBullet"/>
-        <w:spacing w:line="360" w:lineRule="auto"/>
-      </w:pPr>
-      <w:r>
-        <w:rPr>
-          <w:rFonts w:ascii="宋体" w:hAnsi="宋体" w:eastAsia="宋体"/>
-          <w:b w:val="0"/>
-          <w:sz w:val="24"/>
-        </w:rPr>
-        <w:t>喜茶联名：深圳新闻网、广告门、Brandstar/FoodTalks等关于2025 Chiikawa、星星人及降频提质策略。</w:t>
-      </w:r>
-    </w:p>
-    <w:p>
-      <w:pPr>
-        <w:spacing w:before="360"/>
         <w:jc w:val="center"/>
       </w:pPr>
       <w:r>
@@ -4225,7 +3410,7 @@
           <w:b w:val="0"/>
           <w:sz w:val="24"/>
         </w:rPr>
-        <w:t>—— 完 ——</w:t>
+        <w:t>—— 第二版完 ——</w:t>
       </w:r>
     </w:p>
     <w:sectPr>
@@ -4601,10 +3786,6 @@
     <w:name w:val="Normal"/>
     <w:qFormat/>
     <w:rsid w:val="00FC693F"/>
-    <w:rPr>
-      <w:rFonts w:ascii="宋体" w:hAnsi="宋体" w:eastAsia="宋体"/>
-      <w:sz w:val="24"/>
-    </w:rPr>
   </w:style>
   <w:style w:type="paragraph" w:styleId="Header">
     <w:name w:val="header"/>

</xml_diff>